<commit_message>
Rewrite prose in natural academic English; fix flow-loss wording in Section 3.1
Co-Authored-By: Claude Sonnet 5.5 <noreply@anthropic.com>
Claude-Session: https://claude.ai/code/session_015MZUD2t4mu2jrXpfMooaCG
</commit_message>
<xml_diff>
--- a/deliverables/ISR_manuscript.docx
+++ b/deliverables/ISR_manuscript.docx
@@ -142,7 +142,7 @@
         <w:pStyle w:val="FirstParagraph"/>
       </w:pPr>
       <w:r>
-        <w:t xml:space="preserve">Firms increasingly build complementary IT assets, such as fine-tuned adapters, on foundation-model platforms they do not control, and each platform upgrade destroys part or all of those assets. We study this post-adoption maintenance problem as an interaction between an adopter’s real-option decision and a platform owner’s choice of release cadence and compatibility support. At every upgrade a firm can copy its asset, which is free but imperfect; transfer it with a costly compatibility tool that recovers a share</w:t>
+        <w:t xml:space="preserve">Firms increasingly build complementary IT assets, such as fine-tuned adapters, on foundation-model platforms that they do not control, and every platform upgrade destroys some or all of that value. We study this post-adoption maintenance problem as an interaction between the adopter’s real-option decision and the platform owner’s choice of release cadence and compatibility support. At each upgrade a firm can copy its asset, which is free but imperfect, transfer it with a costly compatibility tool that recovers a share</w:t>
       </w:r>
       <w:r>
         <w:t xml:space="preserve"> </w:t>
@@ -156,7 +156,7 @@
         <w:t xml:space="preserve"> </w:t>
       </w:r>
       <w:r>
-        <w:t xml:space="preserve">of its value; or retrain it, an irreversible investment that expires at the next upgrade. The retraining threshold rises with the recovery rate as</w:t>
+        <w:t xml:space="preserve">of its value, or retrain it, an irreversible investment that expires at the next upgrade. The retraining threshold rises with the recovery rate as</w:t>
       </w:r>
       <w:r>
         <w:t xml:space="preserve"> </w:t>
@@ -195,7 +195,10 @@
         </m:d>
       </m:oMath>
       <w:r>
-        <w:t xml:space="preserve">, with upgrade intensity, and with value volatility. A free copy weakly dominates immediate retraining, and a costly tool is optimal only for assets of intermediate value and only when its cost is below a bound</w:t>
+        <w:t xml:space="preserve"> </w:t>
+      </w:r>
+      <w:r>
+        <w:t xml:space="preserve">and also with upgrade intensity and value volatility. A free copy weakly dominates immediate retraining, and a costly tool is optimal only for assets of intermediate value and only when its cost falls below a bound</w:t>
       </w:r>
       <w:r>
         <w:t xml:space="preserve"> </w:t>
@@ -206,7 +209,7 @@
         </m:r>
       </m:oMath>
       <w:r>
-        <w:t xml:space="preserve">. We then let the platform owner choose how often to release. An owner that captures part of enterprise surplus over-releases if and only if the average customer is harmed at the margin by a faster clock. Compatibility tools and release speed are strategic complements for any distribution of asset values, so better tools invite faster release and can leave firms that retrain anyway worse off. Under logit duopoly with a release race, each owner internalizes exactly one-third of the marginal change in customer surplus, and, in numerical analysis, an intermediate race separates owners into a fast, compatible frontier platform and a slow, stable one. Release histories of six open-weight model families imply about two main-line versions per year, and recovery measured on open model pairs (160M to 3B parameters) on three tasks falls with upgrade size, with room for a costly transfer method in only two of 24 pair-task combinations. The practical rule that follows is simple: copy by default, buy a transfer tool only when its measured cost is below</w:t>
+        <w:t xml:space="preserve">. When the platform owner chooses how often to release, an owner that captures part of enterprise surplus over-releases if and only if the average customer is harmed at the margin by a faster clock. Compatibility tools and release speed are strategic complements for any distribution of asset values, so better tools invite faster release and can leave firms that retrain anyway worse off. Under logit duopoly with a release race, each owner internalizes exactly one-third of the marginal change in customer surplus, and numerical analysis shows that an intermediate race separates owners into a fast, compatible frontier platform and a slow, stable one. Release histories of six open-weight model families imply about two main-line versions per year. Recovery measured on open model pairs of 160M to 3B parameters, on three tasks, falls with the size of the upgrade, and a costly transfer method has room to pay in only two of 24 pair-task combinations. The practical rule that follows is to copy by default, to buy a transfer tool only when its measured cost is below</w:t>
       </w:r>
       <w:r>
         <w:t xml:space="preserve"> </w:t>
@@ -217,7 +220,7 @@
         </m:r>
       </m:oMath>
       <w:r>
-        <w:t xml:space="preserve">, and read the arrival of owner-provided compatibility tooling as a signal of faster release. The results recast compatibility tooling as a governance variable that the platform owner sets jointly with the pace of change.</w:t>
+        <w:t xml:space="preserve">, and to read the arrival of owner-provided compatibility tooling as a signal of faster release. Compatibility tooling is thus a governance variable that the platform owner sets jointly with the pace of change.</w:t>
       </w:r>
     </w:p>
     <w:bookmarkEnd w:id="20"/>
@@ -235,7 +238,7 @@
         <w:pStyle w:val="FirstParagraph"/>
       </w:pPr>
       <w:r>
-        <w:t xml:space="preserve">Information systems research has long treated platforms as bundles of options for the firms that build on them (Fichman 2004) and has examined how platform owners govern the architecture and the boundary between platform and complements (Tiwana et al. 2010, Ghazawneh and Henfridsson 2013). A less examined question is what happens</w:t>
+        <w:t xml:space="preserve">Information systems research has long treated platforms as bundles of options for the firms that build on them (Fichman 2004), and it has examined how platform owners govern architecture and the boundary between the platform and its complements (Tiwana et al. 2010, Ghazawneh and Henfridsson 2013). Less attention has gone to what happens</w:t>
       </w:r>
       <w:r>
         <w:t xml:space="preserve"> </w:t>
@@ -251,7 +254,7 @@
         <w:t xml:space="preserve"> </w:t>
       </w:r>
       <w:r>
-        <w:t xml:space="preserve">adoption, when the platform is replaced underneath assets the adopter has already built. Foundation models make this question concrete and urgent. A fine-tuned low-rank adapter is cheap to train on a given base model and worthless, as a weight file, on the next one. Open-weight families release on the order of two main-line versions a year. The standard engineering response, retraining every adapter at every upgrade, treats the platform’s clock as a fact of nature and the firm’s cost as a sunk operating expense. Both treatments are incomplete, and the incompleteness is an information systems problem: it concerns the maintenance of IT assets that depend on a platform controlled by someone else.</w:t>
+        <w:t xml:space="preserve">adoption, when the platform is replaced beneath assets that the adopter has already built. Foundation models make the question concrete. A fine-tuned low-rank adapter is cheap to train on a given base model, yet as a weight file it is worthless on the next one, and open-weight families ship roughly two main-line versions a year. The usual engineering response is to retrain every adapter at every upgrade. That response takes the platform’s clock as a fact of nature and the firm’s cost as a sunk operating expense, and both assumptions are questionable. The problem belongs to information systems research because it concerns the maintenance of IT assets that depend on a platform someone else controls.</w:t>
       </w:r>
     </w:p>
     <w:p>
@@ -259,7 +262,7 @@
         <w:pStyle w:val="BodyText"/>
       </w:pPr>
       <w:r>
-        <w:t xml:space="preserve">Retraining is an irreversible investment whose payoff is uncertain and whose life ends when the platform owner ships again. That is the textbook setting of real options (McDonald and Siegel 1986, Dixit and Pindyck 1994), and the right to wait has value. Compatibility and transfer tools that move an adapter without its original training data change the option: they buy a recovery rate</w:t>
+        <w:t xml:space="preserve">Retraining is an irreversible investment with an uncertain payoff, and its useful life ends when the platform owner ships again. This is the textbook setting for real options (McDonald and Siegel 1986, Dixit and Pindyck 1994): the right to wait has value. Tools that move an adapter to a new base model without the original training data alter the option. They buy a recovery rate</w:t>
       </w:r>
       <w:r>
         <w:t xml:space="preserve"> </w:t>
@@ -287,7 +290,7 @@
         <w:t xml:space="preserve"> </w:t>
       </w:r>
       <w:r>
-        <w:t xml:space="preserve">and shift the exercise threshold. A free, naive copy of the adapter weights is itself a transfer technology with</w:t>
+        <w:t xml:space="preserve">and shift the exercise threshold. A free, naive copy of the adapter weights is itself such a tool, with</w:t>
       </w:r>
       <w:r>
         <w:t xml:space="preserve"> </w:t>
@@ -315,7 +318,7 @@
         <w:pStyle w:val="BodyText"/>
       </w:pPr>
       <w:r>
-        <w:t xml:space="preserve">The more important part is that the clock is chosen. Platform owners release to win benchmarks, developers, and publicity, and much of the cost of each release falls on enterprise customers. Compatibility tools restore part of the destroyed option and, precisely because they do, change the owner’s incentive to destroy it. Better compatibility is therefore not an unmixed blessing for the firms that use it. It invites faster release, and firms that would have retrained anyway bear a higher cadence and can be made worse off.</w:t>
+        <w:t xml:space="preserve">The clock, however, is chosen by someone. Platform owners release to win benchmarks, developers, and publicity, and much of the cost of each release falls on enterprise customers. Compatibility tools restore part of the option that a release destroys, and for that very reason they change the owner’s incentive to destroy it. Better compatibility is therefore a mixed blessing for the firms that use it. It invites faster release, and firms that would have retrained anyway then face a higher cadence and can end up worse off.</w:t>
       </w:r>
     </w:p>
     <w:p>
@@ -323,7 +326,7 @@
         <w:pStyle w:val="BodyText"/>
       </w:pPr>
       <w:r>
-        <w:t xml:space="preserve">We ask three questions. First, given an exogenous release intensity, when should a firm copy, transfer, or retrain a complementary asset that dies at the next upgrade? Second, when the platform owner chooses intensity and possibly compatibility, does it release too often, and how does transfer technology feed back into that choice? Third, if owners compete for enterprise customers and for a general-market prize tied to release speed, how much of the change in customer surplus do they internalize, and can they differentiate on the speed–compatibility bundle?</w:t>
+        <w:t xml:space="preserve">We ask three questions. First, given an exogenous release intensity, when should a firm copy, transfer, or retrain a complementary asset that expires at the next upgrade? Second, when the platform owner chooses the intensity, and possibly compatibility as well, does it release too often, and how does transfer technology feed back into that choice? Third, if owners compete for enterprise customers and for a general-market prize tied to release speed, how much of the change in customer surplus do they internalize, and can they differentiate on a speed–compatibility bundle?</w:t>
       </w:r>
     </w:p>
     <w:p>
@@ -341,7 +344,7 @@
         <w:t xml:space="preserve"> </w:t>
       </w:r>
       <w:r>
-        <w:t xml:space="preserve">Table 1 lists the results, the intuition behind each, and what each means for information systems research and practice.</w:t>
+        <w:t xml:space="preserve">Table 1 lists the results, the intuition behind each, and what each implies for information systems research and practice.</w:t>
       </w:r>
     </w:p>
     <w:tbl>
@@ -769,23 +772,7 @@
         <w:t xml:space="preserve"> </w:t>
       </w:r>
       <w:r>
-        <w:t xml:space="preserve">The model’s central prescription is a default:</w:t>
-      </w:r>
-      <w:r>
-        <w:t xml:space="preserve"> </w:t>
-      </w:r>
-      <w:r>
-        <w:rPr>
-          <w:iCs/>
-          <w:i/>
-        </w:rPr>
-        <w:t xml:space="preserve">when free copy recovers most of the value, copy.</w:t>
-      </w:r>
-      <w:r>
-        <w:t xml:space="preserve"> </w:t>
-      </w:r>
-      <w:r>
-        <w:t xml:space="preserve">Retraining is warranted only for assets whose value exceeds a threshold that is high relative to the NPV rule, and a costly transfer tool pays only in a bounded intermediate band and only if its cost is below</w:t>
+        <w:t xml:space="preserve">The model’s central prescription is a default: when free copy recovers most of the value, copy. Retraining is warranted only for assets whose value exceeds a threshold that lies well above the NPV threshold, and a costly transfer tool pays only in a bounded intermediate band and only if its cost is below</w:t>
       </w:r>
       <w:r>
         <w:t xml:space="preserve"> </w:t>
@@ -796,7 +783,7 @@
         </m:r>
       </m:oMath>
       <w:r>
-        <w:t xml:space="preserve">. Our measurements fit this default. In 22 of the 24 pair-task combinations we tested, free copy leaves too little to gain for any costly method with a plausible cost to be worthwhile; the exceptions are large upgrades of a 160M-parameter model on two tasks, where copy recovered 40 and 67 percent of the retraining gain (a third task is borderline). Where copy recovers little and no tool helps, as for summarization with instruction-tuned targets, the model says to retrain. The default is therefore a first step that must be checked on a sample, not an unconditional rule. The paper therefore argues against two habits that look prudent: retraining at every upgrade, and buying compatibility tools by default.</w:t>
+        <w:t xml:space="preserve">. Our measurements are consistent with this default. In 22 of the 24 pair-task combinations we tested, free copy leaves too little to gain for any costly method with a plausible cost to pay off. The exceptions are large upgrades of a 160M-parameter model on two tasks, where copy recovered 40 and 67 percent of the retraining gain, and a third task is borderline. Where copy recovers little and no tool helps, as with summarization and instruction-tuned targets, the model says to retrain. The default is thus a first step to be checked on a sample, not an unconditional rule. It argues against two habits that look prudent, retraining at every upgrade and buying compatibility tools by default.</w:t>
       </w:r>
     </w:p>
     <w:p>
@@ -804,7 +791,7 @@
         <w:pStyle w:val="BodyText"/>
       </w:pPr>
       <w:r>
-        <w:t xml:space="preserve">Two empirical inputs discipline the model; they are not the contribution. Public release dates for Llama, Gemma, Phi, Qwen, Mistral, and DeepSeek through 28 September 2026 imply a pooled primary-definition intensity of 1.97 main-line versions per year. Recovery rates measured on open model pairs, on math reasoning, summarization, and text-to-SQL, show that upgrade size and the task, not the brand of transfer method, are the first-order determinants of</w:t>
+        <w:t xml:space="preserve">Two empirical inputs discipline the model, though neither is a contribution in itself. Public release dates for Llama, Gemma, Phi, Qwen, Mistral, and DeepSeek through 28 September 2026 imply a pooled primary-definition intensity of 1.97 main-line versions per year. Recovery rates measured on open model pairs, on math reasoning, summarization, and text-to-SQL, show that the size of the upgrade and the task, rather than the brand of transfer method, are the first-order determinants of</w:t>
       </w:r>
       <w:r>
         <w:t xml:space="preserve"> </w:t>
@@ -815,7 +802,7 @@
         </m:r>
       </m:oMath>
       <w:r>
-        <w:t xml:space="preserve">. After small continued-training upgrades of a 160M-parameter model a naive copy recovered 91 to 97 percent of the retraining gain on all three tasks. After a large upgrade it recovered 35 to 67 percent, depending on the task. In the larger models copy recovered 79 to 99 percent after the large upgrade on two tasks and only 12 percent on summarization, and a costly transfer method added little beyond copy except on summarization (means over three to five seeds). These facts are used as</w:t>
+        <w:t xml:space="preserve">. After small continued-training upgrades of a 160M-parameter model, a naive copy recovered 91 to 97 percent of the retraining gain on all three tasks; after a large upgrade it recovered 35 to 67 percent, depending on the task. In the larger models, copy recovered 79 to 99 percent after the large upgrade on two tasks but only 12 percent on summarization, and a costly transfer method added little beyond copy except on summarization (means over three to five seeds). We use these facts as</w:t>
       </w:r>
       <w:r>
         <w:t xml:space="preserve"> </w:t>
@@ -857,7 +844,7 @@
         <w:t xml:space="preserve"> </w:t>
       </w:r>
       <w:r>
-        <w:t xml:space="preserve">inputs. A particular converter used only to measure one</w:t>
+        <w:t xml:space="preserve">inputs. The converter we used to measure one</w:t>
       </w:r>
       <w:r>
         <w:t xml:space="preserve"> </w:t>
@@ -890,7 +877,7 @@
         <w:t xml:space="preserve"> </w:t>
       </w:r>
       <w:r>
-        <w:t xml:space="preserve">pair is confined to the online appendix and is not a contribution of this paper.</w:t>
+        <w:t xml:space="preserve">pair is described in the online appendix and is not a contribution of the paper.</w:t>
       </w:r>
     </w:p>
     <w:p>
@@ -908,23 +895,7 @@
         <w:t xml:space="preserve"> </w:t>
       </w:r>
       <w:r>
-        <w:t xml:space="preserve">The paper makes three contributions to information systems research. First, it moves the real-options view of IT platforms (Fichman 2004, Taudes et al. 2000, Benaroch and Kauffman 1999) from the adoption decision to</w:t>
-      </w:r>
-      <w:r>
-        <w:t xml:space="preserve"> </w:t>
-      </w:r>
-      <w:r>
-        <w:rPr>
-          <w:iCs/>
-          <w:i/>
-        </w:rPr>
-        <w:t xml:space="preserve">post-adoption maintenance</w:t>
-      </w:r>
-      <w:r>
-        <w:t xml:space="preserve"> </w:t>
-      </w:r>
-      <w:r>
-        <w:t xml:space="preserve">of complementary assets, and it characterizes the resulting policy regions without reference to any named algorithm. Second, it treats the platform owner as the agent that sets the rate at which the adopter’s options are destroyed, and it identifies a complementarity between compatibility support and release speed with a sharp distributional implication: tools that help some customers hurt others through the cadence they induce. This extends platform-evolution research (Tiwana et al. 2010) with an explicit maintenance channel. Third, it shows how much of the change in customer surplus competing owners internalize and that the speed–compatibility bundle is a dimension along which platforms can separate, which links platform governance to platform competition (Parker and Van Alstyne 2018, Rochet and Tirole 2003). The paper also offers managers a maintenance policy whose qualitative regions do not depend on any named algorithm and whose default is free copy.</w:t>
+        <w:t xml:space="preserve">The paper makes three contributions to information systems research. First, it moves the real-options view of IT platforms (Fichman 2004, Taudes et al. 2000, Benaroch and Kauffman 1999) from the adoption decision to the post-adoption maintenance of complementary assets, and it characterizes the resulting policy regions without reference to any named algorithm. Second, it treats the platform owner as the agent that sets the rate at which the adopter’s options are destroyed. Doing so reveals a complementarity between compatibility support and release speed, with a sharp distributional implication: tools that help some customers hurt others through the cadence they induce. This extends research on platform evolution (Tiwana et al. 2010) with an explicit maintenance channel. Third, it shows how much of the change in customer surplus competing owners internalize, and that the speed–compatibility bundle is a dimension along which platforms can separate, which links platform governance to platform competition (Parker and Van Alstyne 2018, Rochet and Tirole 2003). For managers, the paper offers a maintenance policy whose qualitative regions do not depend on any particular algorithm and whose default is free copy.</w:t>
       </w:r>
     </w:p>
     <w:p>
@@ -932,7 +903,7 @@
         <w:pStyle w:val="BodyText"/>
       </w:pPr>
       <w:r>
-        <w:t xml:space="preserve">The remainder of the paper is organized as follows. Section 2 positions the paper in the literature. Section 3 sets up the model and presents two stylized facts. Section 4 solves the firm’s maintenance option. Sections 5 and 6 study a monopoly owner and competing owners. Section 7 reports robustness and extensions. Section 8 draws implications for research and practice, and Section 9 concludes.</w:t>
+        <w:t xml:space="preserve">The paper proceeds as follows. Section 2 places it in the literature, and Section 3 sets up the model and presents two stylized facts. Section 4 solves the firm’s maintenance option. Sections 5 and 6 turn to a monopoly owner and to competing owners, Section 7 reports robustness checks and extensions, Section 8 draws implications for research and practice, and Section 9 concludes.</w:t>
       </w:r>
     </w:p>
     <w:bookmarkEnd w:id="21"/>
@@ -960,23 +931,7 @@
         <w:t xml:space="preserve"> </w:t>
       </w:r>
       <w:r>
-        <w:t xml:space="preserve">McDonald and Siegel (1986) and Dixit and Pindyck (1994) established that the right to delay an irreversible investment has value. Technology investments fit this logic because implementation costs are partly sunk while standards keep moving (Dos Santos 1991, Grenadier and Weiss 1997, Benaroch and Kauffman 1999, Taudes et al. 2000, Benaroch 2001, Fichman 2004, Kauffman and Li 2005, Santiago and Bifano 2005). Closest in structure are models of adoption when a further innovation is anticipated (Rajagopalan 1999) and of modular upgradeability as insurance against technological change (Kamrad et al. 2013). Recent work applies the same lens to enterprise AI adoption (Tewari 2026). We move the lens from whether to adopt to how to</w:t>
-      </w:r>
-      <w:r>
-        <w:t xml:space="preserve"> </w:t>
-      </w:r>
-      <w:r>
-        <w:rPr>
-          <w:iCs/>
-          <w:i/>
-        </w:rPr>
-        <w:t xml:space="preserve">renew</w:t>
-      </w:r>
-      <w:r>
-        <w:t xml:space="preserve"> </w:t>
-      </w:r>
-      <w:r>
-        <w:t xml:space="preserve">an already deployed complementary asset when the platform underneath it is replaced at a rate the asset owner does not choose, and we make that rate endogenous.</w:t>
+        <w:t xml:space="preserve">McDonald and Siegel (1986) and Dixit and Pindyck (1994) established that the right to delay an irreversible investment has value. The logic fits technology investment well, because implementation costs are partly sunk while standards keep moving (Dos Santos 1991, Grenadier and Weiss 1997, Benaroch and Kauffman 1999, Taudes et al. 2000, Benaroch 2001, Fichman 2004, Kauffman and Li 2005, Santiago and Bifano 2005). The closest models in structure study adoption when a further innovation is anticipated (Rajagopalan 1999) and modular upgradeability as insurance against technological change (Kamrad et al. 2013). More recent work applies the same lens to enterprise AI adoption (Tewari 2026). We shift the question from whether to adopt to how to renew an asset that is already deployed, when the platform underneath it is replaced at a rate the asset owner does not choose, and we make that rate endogenous.</w:t>
       </w:r>
     </w:p>
     <w:p>
@@ -994,7 +949,7 @@
         <w:t xml:space="preserve"> </w:t>
       </w:r>
       <w:r>
-        <w:t xml:space="preserve">Compatibility choices shape adoption and competition (Katz and Shapiro 1985, Farrell and Saloner 1985). Platform owners trade off openness against control over complements (Parker and Van Alstyne 2018), and platform architecture and governance coevolve with the environment (Tiwana et al. 2010, Ghazawneh and Henfridsson 2013, Yoo et al. 2010). Competing platforms can relax price competition through differentiation (Shaked and Sutton 1982) and compete in two-sided markets (Rochet and Tirole 2003, Armstrong 2006). We add a maintenance channel: the platform’s release cadence destroys options held by complementors, compatibility tools partly restore them, and the restoration feeds back into the cadence. The resulting speed–compatibility bundle is a dimension along which competing platforms can separate.</w:t>
+        <w:t xml:space="preserve">Compatibility choices shape adoption and competition (Katz and Shapiro 1985, Farrell and Saloner 1985). Platform owners trade openness off against control over complements (Parker and Van Alstyne 2018), and platform architecture and governance coevolve with the environment (Tiwana et al. 2010, Ghazawneh and Henfridsson 2013, Yoo et al. 2010). Competing platforms can soften price competition through differentiation (Shaked and Sutton 1982) and compete in two-sided markets (Rochet and Tirole 2003, Armstrong 2006). We add a maintenance channel. The platform’s release cadence destroys options held by complementors, compatibility tools partly restore them, and the restoration in turn feeds back into the cadence. The resulting speed–compatibility bundle is a dimension along which competing platforms can separate.</w:t>
       </w:r>
     </w:p>
     <w:p>
@@ -1012,7 +967,7 @@
         <w:t xml:space="preserve"> </w:t>
       </w:r>
       <w:r>
-        <w:t xml:space="preserve">Three conceptual moves connect the model to established IS constructs. First, digital options (Sambamurthy et al. 2003, Fichman 2004) are usually treated as assets the adopter accumulates; here they are assets the platform owner can extinguish, so the option’s life is a choice variable of the owner. Second, compatibility tools such as migration kits, converters, and long-term-support promises are boundary resources in the sense of Ghazawneh and Henfridsson (2013). The literature treats them as instruments for attracting third-party development; we show that they also change the owner’s incentive to change the platform, so that resource provision and platform evolution (Tiwana et al. 2010) cannot be analyzed separately. Third, generativity (Yoo et al. 2010) is the capacity of a platform to be changed by many uncoordinated actors; our model shows its cost side, since a platform whose owner changes it often imposes a maintenance burden that falls unevenly on the actors that build on it.</w:t>
+        <w:t xml:space="preserve">The model connects to three established IS constructs. Digital options (Sambamurthy et al. 2003, Fichman 2004) are usually treated as assets that the adopter accumulates; here they are assets the platform owner can extinguish, so the life of the option is a choice variable of the owner. Compatibility tools such as migration kits, converters, and long-term-support promises are boundary resources in the sense of Ghazawneh and Henfridsson (2013). The literature treats them as instruments for attracting third-party development, whereas we show that they also change the owner’s incentive to change the platform, so resource provision and platform evolution (Tiwana et al. 2010) cannot be analyzed separately. Finally, generativity (Yoo et al. 2010) refers to a platform’s capacity to be changed by many uncoordinated actors. Our model shows its cost side: a platform that its owner changes often imposes a maintenance burden that falls unevenly on the actors who build on it.</w:t>
       </w:r>
     </w:p>
     <w:p>
@@ -1048,7 +1003,7 @@
         <w:t xml:space="preserve"> </w:t>
       </w:r>
       <w:r>
-        <w:t xml:space="preserve">Methods that move adapters without retraining include distillation, subspace projection, and light remapping (Wang et al. 2024, Farhadzadeh et al. 2025a,b, Li et al. 2025, Xia et al. 2025). Hochlehnert et al. (2026) find that naive copy is a strong baseline between related models. In our model every method is a pair</w:t>
+        <w:t xml:space="preserve">Methods for moving adapters without retraining include distillation, subspace projection, and light remapping (Wang et al. 2024, Farhadzadeh et al. 2025a,b, Li et al. 2025, Xia et al. 2025). Hochlehnert et al. (2026) find that naive copy is a strong baseline between related models. In our model every method is simply a pair</w:t>
       </w:r>
       <w:r>
         <w:t xml:space="preserve"> </w:t>
@@ -1078,7 +1033,7 @@
         </m:d>
       </m:oMath>
       <w:r>
-        <w:t xml:space="preserve">, which is what allows us to study the economics without taking a stand on the algorithm.</w:t>
+        <w:t xml:space="preserve">, which lets us study the economics without taking a position on the algorithm.</w:t>
       </w:r>
     </w:p>
     <w:tbl>
@@ -1475,7 +1430,7 @@
         <w:t xml:space="preserve"> </w:t>
       </w:r>
       <w:r>
-        <w:t xml:space="preserve">is the interval from one upgrade to the next. At the start of an epoch the firm chooses a transfer method. During the epoch it may retrain. When the next upgrade arrives, the current adapter and any retraining investment lose their value and a new epoch begins.</w:t>
+        <w:t xml:space="preserve">is the interval between two successive upgrades. At the start of an epoch the firm chooses a transfer method, and during the epoch it may retrain. When the next upgrade arrives, the current adapter and any retraining investment lose their value and a new epoch begins.</w:t>
       </w:r>
     </w:p>
     <w:p>
@@ -1577,7 +1532,7 @@
         </m:r>
       </m:oMath>
       <w:r>
-        <w:t xml:space="preserve">. Running the target without the adapter is always feasible and corresponds to</w:t>
+        <w:t xml:space="preserve">. Running the target model without the adapter is always feasible and corresponds to</w:t>
       </w:r>
       <w:r>
         <w:t xml:space="preserve"> </w:t>
@@ -1597,7 +1552,7 @@
         </m:r>
       </m:oMath>
       <w:r>
-        <w:t xml:space="preserve">, so a method whose measured recovery is negative is treated as</w:t>
+        <w:t xml:space="preserve">, so a method whose measured recovery is negative is treated as having</w:t>
       </w:r>
       <w:r>
         <w:t xml:space="preserve"> </w:t>
@@ -1617,7 +1572,7 @@
         </m:r>
       </m:oMath>
       <w:r>
-        <w:t xml:space="preserve">. Naive copy of adapter weights is</w:t>
+        <w:t xml:space="preserve">. A naive copy of the adapter weights is</w:t>
       </w:r>
       <w:r>
         <w:t xml:space="preserve"> </w:t>
@@ -1656,7 +1611,7 @@
         </m:d>
       </m:oMath>
       <w:r>
-        <w:t xml:space="preserve">. Retraining costs</w:t>
+        <w:t xml:space="preserve">, and retraining costs</w:t>
       </w:r>
       <w:r>
         <w:t xml:space="preserve"> </w:t>
@@ -1713,7 +1668,7 @@
         <w:t xml:space="preserve"> </w:t>
       </w:r>
       <w:r>
-        <w:t xml:space="preserve">when the adapter performs at the retrained level follows geometric Brownian motion</w:t>
+        <w:t xml:space="preserve">that the adapter yields at the retrained level follows a geometric Brownian motion,</w:t>
       </w:r>
       <w:r>
         <w:t xml:space="preserve"> </w:t>
@@ -1772,7 +1727,7 @@
         </m:r>
       </m:oMath>
       <w:r>
-        <w:t xml:space="preserve">. After transfer the firm receives flow</w:t>
+        <w:t xml:space="preserve">. After a transfer the firm loses a flow of</w:t>
       </w:r>
       <w:r>
         <w:t xml:space="preserve"> </w:t>
@@ -1848,7 +1803,7 @@
         </m:r>
       </m:oMath>
       <w:r>
-        <w:t xml:space="preserve">. Upgrades arrive as a Poisson process of intensity</w:t>
+        <w:t xml:space="preserve">, and upgrades arrive as a Poisson process with intensity</w:t>
       </w:r>
       <w:r>
         <w:t xml:space="preserve"> </w:t>
@@ -1905,7 +1860,7 @@
         <w:pStyle w:val="FirstParagraph"/>
       </w:pPr>
       <w:r>
-        <w:t xml:space="preserve">We recorded the date on which weights of each new main-line version of six open-weight families were first publicly available, from each family’s first release through 28 September 2026. The primary definition counts a new version of the family’s main general-purpose text model. A broad definition adds refreshed checkpoints and reasoning variants. The replication package lists every date. Selected dates were re-checked against vendor announcements (Llama 3.3 on 6 December 2024; Gemma 4 on 2 April 2026; DeepSeek-V4.1-Flash on 10 September 2026); see Appendix C.</w:t>
+        <w:t xml:space="preserve">We recorded the date on which the weights of each new main-line version of six open-weight families first became publicly available, from each family’s first release through 28 September 2026. The primary definition counts a new version of the family’s main general-purpose text model; a broad definition adds refreshed checkpoints and reasoning variants. The replication package lists every date. We re-checked selected dates against vendor announcements (Llama 3.3 on 6 December 2024, Gemma 4 on 2 April 2026, and DeepSeek-V4.1-Flash on 10 September 2026); see Appendix D.</w:t>
       </w:r>
     </w:p>
     <w:tbl>
@@ -2652,7 +2607,7 @@
         <w:pStyle w:val="BodyText"/>
       </w:pPr>
       <w:r>
-        <w:t xml:space="preserve">The pooled rate is 1.97 per year. A likelihood-ratio test does not reject a common primary rate across families (</w:t>
+        <w:t xml:space="preserve">The pooled rate is 1.97 per year, and a likelihood-ratio test does not reject a common primary rate across families (</w:t>
       </w:r>
       <m:oMath>
         <m:sSup>
@@ -2711,7 +2666,7 @@
         </m:r>
       </m:oMath>
       <w:r>
-        <w:t xml:space="preserve">). The rate was 2.18 before 2025 and 1.82 after (</w:t>
+        <w:t xml:space="preserve">). The rate was 2.18 before 2025 and 1.82 afterwards (</w:t>
       </w:r>
       <m:oMath>
         <m:r>
@@ -2745,7 +2700,7 @@
         </m:r>
       </m:oMath>
       <w:r>
-        <w:t xml:space="preserve">). Gaps are more regular than exponential: the mean coefficient of variation is 0.46. Platforms can also stop. Llama has had no subsequent open-weight main-line release for 17.8 months as of the window end.</w:t>
+        <w:t xml:space="preserve">). Gaps between releases are more regular than an exponential distribution would imply, with a mean coefficient of variation of 0.46. Platforms can also stop releasing: as of the end of the window, Llama had gone 17.8 months without a new open-weight main-line release.</w:t>
       </w:r>
     </w:p>
     <w:p>
@@ -2818,7 +2773,7 @@
         <w:pStyle w:val="FirstParagraph"/>
       </w:pPr>
       <w:r>
-        <w:t xml:space="preserve">On five open model pairs that share a tokenizer, a rank-8 adapter was trained on the source, retrained on the target, copied, and transferred with a calibration method that reduces to copy as its regularization diverges (Online Appendix C). Each pair was run with five seeds that resample the training and calibration rows and the training order. After two small Pythia continued-training upgrades, copy recovered 0.948 and 0.923 of the retraining gain (means of five seeds; 95% intervals [0.93, 0.97] and [0.90, 0.94]). After a large Pythia upgrade, copy recovered 0.404 (95% interval [0.31, 0.50]) and the calibration method 0.725 ([0.64, 0.81]); the calibration method beat copy in all five seeds. Base-to-instruct upgrades sat in between, at 0.73 to 0.75 for copy, with a gain from the calibration method of at most 0.04. Compute-only cost ratios for the calibration method were 0.35 to 0.61 of retraining and overstate the economic ratio because they omit data acquisition and revalidation. Small upgrades look like high-</w:t>
+        <w:t xml:space="preserve">We measured recovery on five open model pairs that share a tokenizer. For each pair, a rank-8 adapter was trained on the source model, retrained on the target, copied, and transferred with a calibration method that reduces to copy as its regularization diverges (Online Appendix C). Each pair was run with five seeds, which resample the training and calibration rows and the training order. After the two small Pythia continued-training upgrades, copy recovered 0.948 and 0.923 of the retraining gain (means of five seeds, with 95% intervals of [0.93, 0.97] and [0.90, 0.94]). After the large Pythia upgrade, copy recovered 0.404 (95% interval [0.31, 0.50]) and the calibration method 0.725 ([0.64, 0.81]), and the calibration method beat copy in all five seeds. Base-to-instruct upgrades fell in between, with copy at 0.73 to 0.75 and a gain from the calibration method of at most 0.04. The compute-only cost ratios of the calibration method were 0.35 to 0.61 of retraining; they overstate the economic ratio because they leave out data acquisition and revalidation. Small upgrades therefore look like high-</w:t>
       </w:r>
       <m:oMath>
         <m:r>
@@ -2829,7 +2784,7 @@
         <w:t xml:space="preserve"> </w:t>
       </w:r>
       <w:r>
-        <w:t xml:space="preserve">free copy; large upgrades open a gap that a costly method can fill if and only if its cost is below</w:t>
+        <w:t xml:space="preserve">free copy, whereas large upgrades open a gap that a costly method can fill if and only if its cost is below</w:t>
       </w:r>
       <w:r>
         <w:t xml:space="preserve"> </w:t>
@@ -2848,7 +2803,7 @@
         <w:pStyle w:val="BodyText"/>
       </w:pPr>
       <w:r>
-        <w:t xml:space="preserve">We repeated the design on five pairs of larger models (1.4B to 3B parameters, five seeds; 4 seeds for the 3B pair; Online Appendix C, Table C.2). Recovery still falls with upgrade size, but much less: copy recovered 0.987 [0.95, 1.03] after the small Pythia-1.4B upgrade and 0.786 [0.72, 0.85] after the large one, against 0.40 for the 160M model. The calibration method improved on copy by at most 0.03 in the Pythia pairs and by 0.01 for Qwen2.5-1.5B, and did not improve on it for Qwen2.5-3B. Base-to-instruct pairs varied widely: copy recovered 0.81 for Qwen2.5-1.5B and 0.65 for Qwen2.5-3B, and for SmolLM2-1.7B copying made the adapter</w:t>
+        <w:t xml:space="preserve">We repeated the design on five pairs of larger models (1.4B to 3B parameters, with five seeds, or four for the 3B pair; Online Appendix C, Table C.2). Recovery still falls with the size of the upgrade, but much less. Copy recovered 0.987 [0.95, 1.03] after the small Pythia-1.4B upgrade and 0.786 [0.72, 0.85] after the large one, against 0.40 for the 160M model. The calibration method improved on copy by at most 0.03 in the Pythia pairs and by 0.01 for Qwen2.5-1.5B, and it did not improve on copy for Qwen2.5-3B. Base-to-instruct pairs varied widely: copy recovered 0.81 for Qwen2.5-1.5B and 0.65 for Qwen2.5-3B, while for SmolLM2-1.7B copying left the adapter</w:t>
       </w:r>
       <w:r>
         <w:t xml:space="preserve"> </w:t>
@@ -2864,7 +2819,7 @@
         <w:t xml:space="preserve"> </w:t>
       </w:r>
       <w:r>
-        <w:t xml:space="preserve">than no adapter (negative recovery), because the instruct model already scores well without one and the retraining gain is small (0.08 nats). The size of the cost-saving room therefore depends on both upgrade size and model scale, and it is small for the larger models in our sample. That is the regime in which the model recommends free copy.</w:t>
+        <w:t xml:space="preserve">than no adapter at all (negative recovery), because the instruct model already scores well without one and the retraining gain is small (0.08 nats). The room for cost savings thus depends on both the size of the upgrade and the scale of the model, and in our sample it is small for the larger models. That is the regime in which the model recommends free copy.</w:t>
       </w:r>
     </w:p>
     <w:p>
@@ -2882,7 +2837,7 @@
         <w:t xml:space="preserve"> </w:t>
       </w:r>
       <w:r>
-        <w:t xml:space="preserve">We repeated the design on two further tasks, summarization (DialogSum) and text-to-SQL (Online Appendix C, Table C.3). For the small continued-training upgrades of the 160M model, copy again recovered 91 to 97 percent on both tasks, so the default of copying is robust to the task. For the large upgrade the recovery of copy varied with the task (0.40 for math reasoning, 0.35 for summarization, 0.67 for SQL), while the calibration method added a similar 0.28 to 0.32 on each; this gain is large enough for</w:t>
+        <w:t xml:space="preserve">We repeated the design on two further tasks, summarization (DialogSum) and text-to-SQL (Online Appendix C, Table C.3). For the small continued-training upgrades of the 160M model, copy again recovered 91 to 97 percent on both tasks, so the default of copying holds across tasks. After the large upgrade, the recovery of copy varied with the task (0.40 for math reasoning, 0.35 for summarization, and 0.67 for SQL), while the calibration method added a similar 0.28 to 0.32 on each. That gain is large enough for</w:t>
       </w:r>
       <w:r>
         <w:t xml:space="preserve"> </w:t>
@@ -2896,7 +2851,7 @@
         <w:t xml:space="preserve"> </w:t>
       </w:r>
       <w:r>
-        <w:t xml:space="preserve">to exceed the reference cost ratio of 0.36 on two of the three tasks (0.45 and 0.82), and is borderline on the third (0.356). In the larger models the picture depends on the task: copy recovered 0.99 on SQL after the large Pythia-1.4B upgrade and 0.79 on math reasoning, but only 0.12 on summarization (three seeds; the interval spans zero), where the calibration method reached 0.28. For base-to-instruct pairs on summarization, copy recovered between</w:t>
+        <w:t xml:space="preserve">to exceed the reference cost ratio of 0.36 on two of the three tasks (0.45 and 0.82) and is borderline on the third (0.356). In the larger models the picture depends on the task. After the large Pythia-1.4B upgrade, copy recovered 0.99 on SQL and 0.79 on math reasoning but only 0.12 on summarization (three seeds, with an interval that spans zero), where the calibration method reached 0.28. For base-to-instruct pairs on summarization, copy recovered between</w:t>
       </w:r>
       <w:r>
         <w:t xml:space="preserve"> </w:t>
@@ -2916,7 +2871,7 @@
         <w:t xml:space="preserve"> </w:t>
       </w:r>
       <w:r>
-        <w:t xml:space="preserve">and 0.63 and the calibration method never improved on it reliably. These pairs are the cases in which the model recommends retraining: copy is of little use and no tool helps.</w:t>
+        <w:t xml:space="preserve">and 0.63, and the calibration method never improved on it reliably. These are the cases in which the model recommends retraining, since copy is of little use and no tool helps.</w:t>
       </w:r>
     </w:p>
     <w:bookmarkEnd w:id="28"/>
@@ -3027,7 +2982,7 @@
         <w:t xml:space="preserve"> </w:t>
       </w:r>
       <w:r>
-        <w:t xml:space="preserve">be the expected present-value multiplier on lost flow until Poisson expiry. The underlying asset of the retraining option is</w:t>
+        <w:t xml:space="preserve">be the expected present-value multiplier on the flow lost until Poisson expiry. The underlying asset of the retraining option is</w:t>
       </w:r>
       <w:r>
         <w:t xml:space="preserve"> </w:t>
@@ -3054,7 +3009,7 @@
         </m:r>
       </m:oMath>
       <w:r>
-        <w:t xml:space="preserve">, the strike is</w:t>
+        <w:t xml:space="preserve">, its strike is</w:t>
       </w:r>
       <w:r>
         <w:t xml:space="preserve"> </w:t>
@@ -3074,7 +3029,7 @@
         </m:sSub>
       </m:oMath>
       <w:r>
-        <w:t xml:space="preserve">, and expiry is the next upgrade. Let</w:t>
+        <w:t xml:space="preserve">, and it expires at the next upgrade. Let</w:t>
       </w:r>
       <w:r>
         <w:t xml:space="preserve"> </w:t>
@@ -3718,7 +3673,7 @@
         </m:r>
       </m:oMath>
       <w:r>
-        <w:t xml:space="preserve">,</w:t>
+        <w:t xml:space="preserve">, and</w:t>
       </w:r>
       <w:r>
         <w:t xml:space="preserve"> </w:t>
@@ -3738,10 +3693,7 @@
         </m:r>
       </m:oMath>
       <w:r>
-        <w:t xml:space="preserve"> </w:t>
-      </w:r>
-      <w:r>
-        <w:t xml:space="preserve">one has</w:t>
+        <w:t xml:space="preserve">, one has</w:t>
       </w:r>
       <w:r>
         <w:t xml:space="preserve"> </w:t>
@@ -5101,7 +5053,7 @@
         <w:pStyle w:val="BodyText"/>
       </w:pPr>
       <w:r>
-        <w:t xml:space="preserve">The platform a firm has already chosen is itself an input to the maintenance rule. Feeding the five measured</w:t>
+        <w:t xml:space="preserve">The platform a firm has already chosen is itself an input to the maintenance rule. When we feed the measured</w:t>
       </w:r>
       <w:r>
         <w:t xml:space="preserve"> </w:t>
@@ -5134,7 +5086,7 @@
         <w:t xml:space="preserve"> </w:t>
       </w:r>
       <w:r>
-        <w:t xml:space="preserve">pairs into the same formulas produces an actual transfer-optimal region only for the large Pythia upgrade. There the bound is</w:t>
+        <w:t xml:space="preserve">pairs of the five smaller pairs into the same formulas, an actual transfer-optimal region appears only for the large Pythia upgrade. There the bound is</w:t>
       </w:r>
       <w:r>
         <w:t xml:space="preserve"> </w:t>
@@ -5157,7 +5109,7 @@
         <w:t xml:space="preserve"> </w:t>
       </w:r>
       <w:r>
-        <w:t xml:space="preserve">at the seed-mean recovery rates and exceeds the compute-only cost ratio 0.36, and the transfer-optimal band is</w:t>
+        <w:t xml:space="preserve">at the seed-mean recovery rates, above the compute-only cost ratio of 0.36, and the transfer-optimal band is</w:t>
       </w:r>
       <w:r>
         <w:t xml:space="preserve"> </w:t>
@@ -5210,7 +5162,7 @@
         <w:t xml:space="preserve"> </w:t>
       </w:r>
       <w:r>
-        <w:t xml:space="preserve">between 0.37 and 0.50), but it is sensitive to measurement error: at the least favorable corner of the two 95% intervals</w:t>
+        <w:t xml:space="preserve">between 0.37 and 0.50), but it is sensitive to measurement error: at the least favorable corner of the two 95% intervals,</w:t>
       </w:r>
       <w:r>
         <w:t xml:space="preserve"> </w:t>
@@ -5230,7 +5182,7 @@
         </m:r>
       </m:oMath>
       <w:r>
-        <w:t xml:space="preserve">, below the cost ratio. For the two small upgrades and the two base-to-instruct pairs</w:t>
+        <w:t xml:space="preserve">, which is below the cost ratio. For the two small upgrades and the two base-to-instruct pairs,</w:t>
       </w:r>
       <w:r>
         <w:t xml:space="preserve"> </w:t>
@@ -5244,7 +5196,7 @@
         <w:t xml:space="preserve"> </w:t>
       </w:r>
       <w:r>
-        <w:t xml:space="preserve">is between 0 and 0.12 and no costly method has a market. For the larger models,</w:t>
+        <w:t xml:space="preserve">lies between 0 and 0.12 and no costly method has a market. For the larger models,</w:t>
       </w:r>
       <w:r>
         <w:t xml:space="preserve"> </w:t>
@@ -5258,7 +5210,7 @@
         <w:t xml:space="preserve"> </w:t>
       </w:r>
       <w:r>
-        <w:t xml:space="preserve">is about 0.07 for Pythia-1.4B after the large upgrade and about 0.04 for Qwen2.5-1.5B, and zero for Qwen2.5-3B and SmolLM2-1.7B; for the small Pythia-1.4B upgrade both methods recover essentially everything and</w:t>
+        <w:t xml:space="preserve">is about 0.07 for Pythia-1.4B after the large upgrade, about 0.04 for Qwen2.5-1.5B, and zero for Qwen2.5-3B and SmolLM2-1.7B; after the small Pythia-1.4B upgrade both methods recover essentially everything and</w:t>
       </w:r>
       <w:r>
         <w:t xml:space="preserve"> </w:t>
@@ -5272,7 +5224,7 @@
         <w:t xml:space="preserve"> </w:t>
       </w:r>
       <w:r>
-        <w:t xml:space="preserve">is not informative. With any plausible cost ratio, such as the 0.36 measured for the 160M models, no costly method pays in the larger models on math reasoning or SQL: free copy is sufficient, which is the prediction of Proposition 2(a). Across all 24 pair-task combinations a costly method pays in two (the large upgrade of the 160M model on math reasoning and on SQL), with a third borderline.</w:t>
+        <w:t xml:space="preserve">is uninformative. With any plausible cost ratio, such as the 0.36 measured for the 160M models, no costly method pays in the larger models on math reasoning or SQL. Free copy suffices there, as Proposition 2(a) predicts. Across all 24 pair-task combinations, a costly method pays in two (the large upgrade of the 160M model on math reasoning and on SQL), and a third is borderline.</w:t>
       </w:r>
     </w:p>
     <w:bookmarkEnd w:id="30"/>
@@ -5322,7 +5274,7 @@
         <w:t xml:space="preserve"> </w:t>
       </w:r>
       <w:r>
-        <w:t xml:space="preserve">of Section 4. The retraining threshold collapses to</w:t>
+        <w:t xml:space="preserve">of Section 4, in which the retraining threshold collapses to</w:t>
       </w:r>
       <w:r>
         <w:t xml:space="preserve"> </w:t>
@@ -5430,7 +5382,7 @@
         <w:t xml:space="preserve"> </w:t>
       </w:r>
       <w:r>
-        <w:t xml:space="preserve">of firms each operate one adapter. Values</w:t>
+        <w:t xml:space="preserve">of firms each operate one adapter. Their values</w:t>
       </w:r>
       <w:r>
         <w:t xml:space="preserve"> </w:t>
@@ -5466,7 +5418,7 @@
         </m:r>
       </m:oMath>
       <w:r>
-        <w:t xml:space="preserve">. Write</w:t>
+        <w:t xml:space="preserve">, and we write</w:t>
       </w:r>
       <w:r>
         <w:t xml:space="preserve"> </w:t>
@@ -5507,7 +5459,7 @@
         <w:t xml:space="preserve"> </w:t>
       </w:r>
       <w:r>
-        <w:t xml:space="preserve">for the present value of a unit intensity of such gains. A firm retrains iff</w:t>
+        <w:t xml:space="preserve">for the present value of a unit intensity of such gains. A firm retrains if and only if</w:t>
       </w:r>
       <w:r>
         <w:t xml:space="preserve"> </w:t>
@@ -5548,7 +5500,7 @@
         <w:t xml:space="preserve"> </w:t>
       </w:r>
       <w:r>
-        <w:t xml:space="preserve">at every Poisson upgrade is</w:t>
+        <w:t xml:space="preserve">incurred at every Poisson upgrade is</w:t>
       </w:r>
       <w:r>
         <w:t xml:space="preserve"> </w:t>
@@ -5581,7 +5533,7 @@
         </m:r>
       </m:oMath>
       <w:r>
-        <w:t xml:space="preserve">. The maintenance burden</w:t>
+        <w:t xml:space="preserve">, so the maintenance burden</w:t>
       </w:r>
       <w:r>
         <w:t xml:space="preserve"> </w:t>
@@ -5843,7 +5795,7 @@
         <w:pStyle w:val="BodyText"/>
       </w:pPr>
       <w:r>
-        <w:t xml:space="preserve">A transferring firm’s burden is concave in</w:t>
+        <w:t xml:space="preserve">The burden of a transferring firm is concave in</w:t>
       </w:r>
       <w:r>
         <w:t xml:space="preserve"> </w:t>
@@ -5899,7 +5851,7 @@
         </m:r>
       </m:oMath>
       <w:r>
-        <w:t xml:space="preserve">. A retraining firm’s burden is linear and unbounded. A retraining firm is harmed by more frequent releases whenever</w:t>
+        <w:t xml:space="preserve">, whereas the burden of a retraining firm is linear and unbounded. A retraining firm is therefore harmed by more frequent releases whenever</w:t>
       </w:r>
       <w:r>
         <w:t xml:space="preserve"> </w:t>
@@ -5962,7 +5914,7 @@
         <w:t xml:space="preserve"> </w:t>
       </w:r>
       <w:r>
-        <w:t xml:space="preserve">from the general market, bears development cost</w:t>
+        <w:t xml:space="preserve">from the general market, bears a development cost</w:t>
       </w:r>
       <w:r>
         <w:t xml:space="preserve"> </w:t>
@@ -7295,7 +7247,7 @@
         <w:pStyle w:val="BodyText"/>
       </w:pPr>
       <w:r>
-        <w:t xml:space="preserve">Easier transfer lowers the marginal burden of a release. The owner internalizes share</w:t>
+        <w:t xml:space="preserve">Easier transfer lowers the marginal burden of a release. The owner internalizes the share</w:t>
       </w:r>
       <w:r>
         <w:t xml:space="preserve"> </w:t>
@@ -7309,7 +7261,7 @@
         <w:t xml:space="preserve"> </w:t>
       </w:r>
       <w:r>
-        <w:t xml:space="preserve">of that reduction and therefore releases more often. The firms that cannot use the tool bear the faster clock.</w:t>
+        <w:t xml:space="preserve">of that reduction and therefore releases more often, while the firms that cannot use the tool bear the faster clock.</w:t>
       </w:r>
     </w:p>
     <w:tbl>
@@ -8069,7 +8021,7 @@
         <w:pStyle w:val="FirstParagraph"/>
       </w:pPr>
       <w:r>
-        <w:t xml:space="preserve">Owners first choose intensities (and, later, compatibilities) simultaneously, then set enterprise prices, then firms choose an owner and stay with it. A firm of value</w:t>
+        <w:t xml:space="preserve">Owners first choose intensities (and, later, compatibilities) simultaneously and then set enterprise prices; firms then choose an owner and stay with it. A firm of value</w:t>
       </w:r>
       <w:r>
         <w:t xml:space="preserve"> </w:t>
@@ -8196,7 +8148,7 @@
         </m:r>
       </m:oMath>
       <w:r>
-        <w:t xml:space="preserve">, with</w:t>
+        <w:t xml:space="preserve">, where the</w:t>
       </w:r>
       <w:r>
         <w:t xml:space="preserve"> </w:t>
@@ -8219,7 +8171,7 @@
         <w:t xml:space="preserve"> </w:t>
       </w:r>
       <w:r>
-        <w:t xml:space="preserve">i.i.d. Gumbel. A general-market prize</w:t>
+        <w:t xml:space="preserve">are i.i.d. Gumbel. A general-market prize</w:t>
       </w:r>
       <w:r>
         <w:t xml:space="preserve"> </w:t>
@@ -8899,7 +8851,7 @@
         <w:t xml:space="preserve"> </w:t>
       </w:r>
       <w:r>
-        <w:t xml:space="preserve">When each owner also chooses</w:t>
+        <w:t xml:space="preserve">Suppose each owner also chooses</w:t>
       </w:r>
       <w:r>
         <w:t xml:space="preserve"> </w:t>
@@ -8995,7 +8947,7 @@
         </m:d>
       </m:oMath>
       <w:r>
-        <w:t xml:space="preserve">, the symmetric candidate is an equilibrium at weak race intensity and fails at intermediate race intensity. At the latter, an asymmetric equilibrium appears: a frontier owner that is fast and compatible and a stable owner that is slow and sparse. Mid-value transferring firms sort to the frontier owner; the highest-value retraining firms lean to the stable owner. When the race is very intense both owners become fast and compatible. This is a grid-search finding at one parameterization, not a theorem, and multiple equilibria exist at some</w:t>
+        <w:t xml:space="preserve">. The symmetric candidate is an equilibrium when the race is weak and fails when it is of intermediate intensity. In the latter case an asymmetric equilibrium appears, with a frontier owner that is fast and compatible and a stable owner that is slow and sparse. Mid-value transferring firms sort to the frontier owner, while the highest-value retraining firms lean toward the stable owner. When the race is very intense, both owners become fast and compatible. This is a grid-search finding at one parameterization rather than a theorem, and multiple equilibria exist at some values of</w:t>
       </w:r>
       <w:r>
         <w:t xml:space="preserve"> </w:t>
@@ -9057,10 +9009,7 @@
         </m:r>
       </m:oMath>
       <w:r>
-        <w:t xml:space="preserve"> </w:t>
-      </w:r>
-      <w:r>
-        <w:t xml:space="preserve">the asymmetric pair at</w:t>
+        <w:t xml:space="preserve">, the asymmetric pair at</w:t>
       </w:r>
       <w:r>
         <w:t xml:space="preserve"> </w:t>
@@ -9174,7 +9123,7 @@
         </m:d>
       </m:oMath>
       <w:r>
-        <w:t xml:space="preserve">. Prices in that illustration are 26.4 and 17.3. Mean customer value is 18.2 on the frontier platform and 22.8 on the stable platform.</w:t>
+        <w:t xml:space="preserve">. Prices in this illustration are 26.4 and 17.3, and mean customer value is 18.2 on the frontier platform and 22.8 on the stable platform.</w:t>
       </w:r>
     </w:p>
     <w:p>
@@ -9256,7 +9205,7 @@
       </w:r>
     </w:p>
     <w:bookmarkEnd w:id="41"/>
-    <w:bookmarkStart w:id="54" w:name="robustness-and-extensions"/>
+    <w:bookmarkStart w:id="51" w:name="robustness-and-extensions"/>
     <w:p>
       <w:pPr>
         <w:pStyle w:val="Heading2"/>
@@ -9279,7 +9228,7 @@
         <w:pStyle w:val="FirstParagraph"/>
       </w:pPr>
       <w:r>
-        <w:t xml:space="preserve">Replace the exponential epoch length by a gamma law matched to each family’s mean gap and CV, or by a deterministic gap. The loss multiplier</w:t>
+        <w:t xml:space="preserve">Replace the exponential epoch length by a gamma law matched to each family’s mean gap and coefficient of variation, or by a deterministic gap. The loss multiplier</w:t>
       </w:r>
       <w:r>
         <w:t xml:space="preserve"> </w:t>
@@ -9372,7 +9321,7 @@
         <w:t xml:space="preserve"> </w:t>
       </w:r>
       <w:r>
-        <w:t xml:space="preserve">is 1 to 4 percent smaller than under Poisson (gamma-to-Poisson ratios 0.96 to 0.99). Average burden barely moves. What regularity changes is timing: with a predictable release the retraining threshold should rise as the date approaches (Rajagopalan 1999). The time-homogeneous</w:t>
+        <w:t xml:space="preserve">is 1 to 4 percent smaller than under Poisson (gamma-to-Poisson ratios of 0.96 to 0.99), so the average burden barely moves. What regularity changes is timing: with a predictable release, the retraining threshold should rise as the date approaches (Rajagopalan 1999). The time-homogeneous</w:t>
       </w:r>
       <w:r>
         <w:t xml:space="preserve"> </w:t>
@@ -9398,7 +9347,7 @@
         <w:t xml:space="preserve"> </w:t>
       </w:r>
       <w:r>
-        <w:t xml:space="preserve">should be read as an average over the epoch.</w:t>
+        <w:t xml:space="preserve">should therefore be read as an average over the epoch.</w:t>
       </w:r>
     </w:p>
     <w:tbl>
@@ -9894,7 +9843,7 @@
         <w:pStyle w:val="FirstParagraph"/>
       </w:pPr>
       <w:r>
-        <w:t xml:space="preserve">If the adapter creates value only above a quality floor</w:t>
+        <w:t xml:space="preserve">Suppose the adapter creates value only above a quality floor</w:t>
       </w:r>
       <w:r>
         <w:t xml:space="preserve"> </w:t>
@@ -9917,7 +9866,7 @@
         </m:sSub>
       </m:oMath>
       <w:r>
-        <w:t xml:space="preserve">, effective recovery is 0 when</w:t>
+        <w:t xml:space="preserve">, so that effective recovery is 0 when</w:t>
       </w:r>
       <w:r>
         <w:t xml:space="preserve"> </w:t>
@@ -10006,7 +9955,7 @@
         <w:t xml:space="preserve"> </w:t>
       </w:r>
       <w:r>
-        <w:t xml:space="preserve">jump when a method crosses the floor. A large upgrade that drops copy below the floor and leaves a costly method above it widens</w:t>
+        <w:t xml:space="preserve">jump when a method crosses the floor. A large upgrade that drops copy below the floor but leaves a costly method above it widens</w:t>
       </w:r>
       <w:r>
         <w:t xml:space="preserve"> </w:t>
@@ -10017,7 +9966,7 @@
         </m:r>
       </m:oMath>
       <w:r>
-        <w:t xml:space="preserve">. Linear loss understates the value of transfer exactly when the upgrade is large. It does not overturn weak dominance of copy when copy itself stays above the floor.</w:t>
+        <w:t xml:space="preserve">. Linear loss thus understates the value of transfer exactly when the upgrade is large. It does not overturn the weak dominance of copy when copy itself stays above the floor.</w:t>
       </w:r>
     </w:p>
     <w:bookmarkEnd w:id="43"/>
@@ -10035,7 +9984,7 @@
         <w:pStyle w:val="FirstParagraph"/>
       </w:pPr>
       <w:r>
-        <w:t xml:space="preserve">Section 6 assumes a firm stays with its first owner. Consider a two-period variant. In period 0 owners choose</w:t>
+        <w:t xml:space="preserve">Section 6 assumes that a firm stays with its first owner. Consider a two-period variant in which owners choose</w:t>
       </w:r>
       <w:r>
         <w:t xml:space="preserve"> </w:t>
@@ -10086,7 +10035,7 @@
         <w:t xml:space="preserve"> </w:t>
       </w:r>
       <w:r>
-        <w:t xml:space="preserve">and prices. Firms choose an owner. After the first upgrade, a firm may switch at a cost</w:t>
+        <w:t xml:space="preserve">and prices in period 0 and firms then choose an owner. After the first upgrade, a firm may switch at a cost</w:t>
       </w:r>
       <w:r>
         <w:t xml:space="preserve"> </w:t>
@@ -10145,21 +10094,7 @@
         </m:d>
       </m:oMath>
       <w:r>
-        <w:t xml:space="preserve">. Interpret</w:t>
-      </w:r>
-      <w:r>
-        <w:t xml:space="preserve"> </w:t>
-      </w:r>
-      <m:oMath>
-        <m:r>
-          <m:t>ω</m:t>
-        </m:r>
-      </m:oMath>
-      <w:r>
-        <w:t xml:space="preserve"> </w:t>
-      </w:r>
-      <w:r>
-        <w:t xml:space="preserve">as the labor of rebuilding the complementary asset on the rival stack. A transfer technology that is stack-agnostic lowers</w:t>
+        <w:t xml:space="preserve">, which we interpret as the labor of rebuilding the complementary asset on the rival stack. A transfer technology that is stack-agnostic lowers</w:t>
       </w:r>
       <w:r>
         <w:t xml:space="preserve"> </w:t>
@@ -10214,7 +10149,7 @@
         <w:t xml:space="preserve"> </w:t>
       </w:r>
       <w:r>
-        <w:t xml:space="preserve">for the period-1 continuation, including the option to switch. The period-0 choice probability remains logit in</w:t>
+        <w:t xml:space="preserve">for the period-1 continuation value, including the option to switch. The period-0 choice probability remains logit in</w:t>
       </w:r>
       <w:r>
         <w:t xml:space="preserve"> </w:t>
@@ -10372,7 +10307,7 @@
         <w:t xml:space="preserve"> </w:t>
       </w:r>
       <w:r>
-        <w:t xml:space="preserve">raises the elasticity of period-0 demand to period-1 quality and price, because the period-1 outside option is closer. In logit, that is a fall in the effective</w:t>
+        <w:t xml:space="preserve">raises the elasticity of period-0 demand with respect to period-1 quality and price, because the period-1 outside option is closer. In the logit model this amounts to a fall in the effective</w:t>
       </w:r>
       <w:r>
         <w:t xml:space="preserve"> </w:t>
@@ -10403,7 +10338,7 @@
         <w:t xml:space="preserve"> </w:t>
       </w:r>
       <w:r>
-        <w:t xml:space="preserve">once continuation is included. Customers capture more of any quality gain.</w:t>
+        <w:t xml:space="preserve">once continuation is included, and customers capture more of any quality gain.</w:t>
       </w:r>
     </w:p>
     <w:p>
@@ -10474,7 +10409,7 @@
         <w:t xml:space="preserve"> </w:t>
       </w:r>
       <w:r>
-        <w:t xml:space="preserve">splits into an own-customer maintenance effect (the Section 5 channel) and a switching-in effect. The second effect is business-stealing. In a symmetric equilibrium business-stealing is a transfer and does not enter welfare, but it does enter the owner’s private return to</w:t>
+        <w:t xml:space="preserve">splits into an own-customer maintenance effect (the channel of Section 5) and a switching-in effect. The second is business-stealing: in a symmetric equilibrium it is a transfer and does not enter welfare, but it does enter the owner’s private return to</w:t>
       </w:r>
       <w:r>
         <w:t xml:space="preserve"> </w:t>
@@ -10552,7 +10487,7 @@
         <w:t xml:space="preserve"> </w:t>
       </w:r>
       <w:r>
-        <w:t xml:space="preserve">is harder to recoup. Compatibility investment therefore falls even as the social return to</w:t>
+        <w:t xml:space="preserve">becomes harder to recoup. Compatibility investment therefore falls even though the social return to</w:t>
       </w:r>
       <w:r>
         <w:t xml:space="preserve"> </w:t>
@@ -10571,7 +10506,7 @@
         <w:pStyle w:val="BodyText"/>
       </w:pPr>
       <w:r>
-        <w:t xml:space="preserve">The one-third weight is consequently an upper bound on under-internalization only inside the no-switching game. Treating transfer purely as a maintenance tool and ignoring portability will overstate the case for owner-provided compatibility as a customer-friendly investment. We do not claim a closed-form analogue of Proposition 5 under switching.</w:t>
+        <w:t xml:space="preserve">The one-third weight is consequently an upper bound on under-internalization only inside the no-switching game. Treating transfer purely as a maintenance tool and ignoring portability would overstate the case for owner-provided compatibility as a customer-friendly investment. We do not claim a closed-form analogue of Proposition 5 under switching.</w:t>
       </w:r>
     </w:p>
     <w:bookmarkEnd w:id="44"/>
@@ -10758,7 +10693,7 @@
         </m:d>
       </m:oMath>
       <w:r>
-        <w:t xml:space="preserve">. This is still a proxy, because the firm’s option value is not the full infinite-horizon object, but it lets the owner respond to a</w:t>
+        <w:t xml:space="preserve">. The result is still a proxy, because the firm’s option value is not the full infinite-horizon object, but it lets the owner respond to a threshold that depends on</w:t>
       </w:r>
       <w:r>
         <w:t xml:space="preserve"> </w:t>
@@ -10769,7 +10704,7 @@
         </m:r>
       </m:oMath>
       <w:r>
-        <w:t xml:space="preserve">-dependent threshold.</w:t>
+        <w:t xml:space="preserve">.</w:t>
       </w:r>
     </w:p>
     <w:tbl>
@@ -11262,7 +11197,7 @@
         <w:t xml:space="preserve"> </w:t>
       </w:r>
       <w:r>
-        <w:t xml:space="preserve">is 0.95 under the static cutoff and 0.93 under the proxy. Complementarity is not an artifact of dropping volatility. Finite-difference estimates of</w:t>
+        <w:t xml:space="preserve">is 0.95 under the static cutoff and 0.93 under the proxy, so complementarity is not an artifact of dropping volatility. Finite-difference estimates of</w:t>
       </w:r>
       <w:r>
         <w:t xml:space="preserve"> </w:t>
@@ -11450,7 +11385,7 @@
         <w:pStyle w:val="FirstParagraph"/>
       </w:pPr>
       <w:r>
-        <w:t xml:space="preserve">The one-third weight uses two logit facts: the own-price markup</w:t>
+        <w:t xml:space="preserve">The one-third weight rests on two logit facts: the own-price markup</w:t>
       </w:r>
       <w:r>
         <w:t xml:space="preserve"> </w:t>
@@ -11476,7 +11411,7 @@
         <w:t xml:space="preserve"> </w:t>
       </w:r>
       <w:r>
-        <w:t xml:space="preserve">at symmetry, and a quality shock that splits one-third into price and one-third into share. Under Hotelling the analogous weight differs. Pure-strategy price equilibria fail when</w:t>
+        <w:t xml:space="preserve">at the symmetric point, and the way a quality shock splits, one-third into price and one-third into share. Under Hotelling competition the analogous weight differs, and pure-strategy price equilibria fail when</w:t>
       </w:r>
       <w:r>
         <w:t xml:space="preserve"> </w:t>
@@ -11490,7 +11425,7 @@
         <w:t xml:space="preserve"> </w:t>
       </w:r>
       <w:r>
-        <w:t xml:space="preserve">is small relative to value heterogeneity. The one-third rule should be read as: competing owners internalize a constant that is strictly less than one-half, and in the standard discrete-choice workhorse that constant is one-third.</w:t>
+        <w:t xml:space="preserve">is small relative to value heterogeneity. The rule should be read as follows: competing owners internalize a constant that is strictly less than one-half, and in the standard discrete-choice workhorse that constant is one-third.</w:t>
       </w:r>
     </w:p>
     <w:bookmarkEnd w:id="46"/>
@@ -11508,7 +11443,7 @@
         <w:pStyle w:val="FirstParagraph"/>
       </w:pPr>
       <w:r>
-        <w:t xml:space="preserve">The numerical illustrations use one parameter vector and uniform values. To check that Propositions 3 to 4 do not depend on them, we solved the monopoly problem on a grid of</w:t>
+        <w:t xml:space="preserve">The numerical illustrations use one parameter vector and uniformly distributed values. To check that Propositions 3 and 4 do not depend on these choices, we solved the monopoly problem on a grid of</w:t>
       </w:r>
       <w:r>
         <w:t xml:space="preserve"> </w:t>
@@ -11935,7 +11870,7 @@
         </m:r>
       </m:oMath>
       <w:r>
-        <w:t xml:space="preserve">, and Pareto with tail index 2.5). The code reproduces Tables 5 and 7 (static columns) exactly. Of the 16,200 cells, 6,505 satisfy the hypotheses of the propositions: the owner’s and the planner’s objectives are globally concave on the grid and both have interior maximizers (Appendix F reports the breakdown). Three results follow. First, strategic complementarity (Proposition 4a) holds in every one of them:</w:t>
+        <w:t xml:space="preserve">, and Pareto with tail index 2.5). The code reproduces Tables 5 and 7 (static columns) exactly. Of the 16,200 cells, 6,505 satisfy the hypotheses of the propositions, namely that the owner’s and the planner’s objectives are globally concave on the grid and both have interior maximizers (Appendix F gives the breakdown). Three results follow. First, strategic complementarity (Proposition 4a) holds in all of these cells:</w:t>
       </w:r>
       <w:r>
         <w:t xml:space="preserve"> </w:t>
@@ -11982,7 +11917,7 @@
         <w:t xml:space="preserve"> </w:t>
       </w:r>
       <w:r>
-        <w:t xml:space="preserve">in 5,212 cells, equals zero in 392 cells, and is negative in none. In every zero cell essentially no firm transfers (the threshold</w:t>
+        <w:t xml:space="preserve">in 5,212 cells, equals zero in 392, and is negative in none. In every zero cell essentially no firm transfers (the threshold</w:t>
       </w:r>
       <w:r>
         <w:t xml:space="preserve"> </w:t>
@@ -12159,7 +12094,7 @@
         <w:t xml:space="preserve"> </w:t>
       </w:r>
       <w:r>
-        <w:t xml:space="preserve">in all 6,505 cells, with 31 exact ties at</w:t>
+        <w:t xml:space="preserve">in all 6,505 cells, including 31 exact ties at</w:t>
       </w:r>
       <w:r>
         <w:t xml:space="preserve"> </w:t>
@@ -12197,7 +12132,7 @@
         </m:sSub>
       </m:oMath>
       <w:r>
-        <w:t xml:space="preserve">. Third, over-release is not an artifact of one parameter vector: it occurs in 23 to 34 percent of valid cells depending on the distribution, and in the uniform case it arises when</w:t>
+        <w:t xml:space="preserve">. Third, over-release does not depend on one parameter vector. It occurs in 23 to 34 percent of the valid cells, depending on the distribution, and in the uniform case it arises when</w:t>
       </w:r>
       <w:r>
         <w:t xml:space="preserve"> </w:t>
@@ -12248,7 +12183,7 @@
     </w:p>
     <w:p>
       <w:pPr>
-        <w:pStyle w:val="BodyText"/>
+        <w:pStyle w:val="CaptionedFigure"/>
       </w:pPr>
       <w:r>
         <w:drawing>
@@ -12292,15 +12227,152 @@
           </wp:inline>
         </w:drawing>
       </w:r>
-      <w:r>
-        <w:t xml:space="preserve"> </w:t>
-      </w:r>
-      <w:r>
-        <w:t xml:space="preserve">## 8. Implications for Research and Practice</w:t>
+    </w:p>
+    <w:p>
+      <w:pPr>
+        <w:pStyle w:val="ImageCaption"/>
+      </w:pPr>
+      <w:r>
+        <w:t xml:space="preserve">Figure 5. Robustness of the monopoly results. (a) Equilibrium intensity as a function of</w:t>
+      </w:r>
+      <w:r>
+        <w:t xml:space="preserve"> </w:t>
+      </w:r>
+      <m:oMath>
+        <m:r>
+          <m:t>R</m:t>
+        </m:r>
+      </m:oMath>
+      <w:r>
+        <w:t xml:space="preserve"> </w:t>
+      </w:r>
+      <w:r>
+        <w:t xml:space="preserve">under six value distributions with common mean (baseline parameters</w:t>
+      </w:r>
+      <w:r>
+        <w:t xml:space="preserve"> </w:t>
+      </w:r>
+      <m:oMath>
+        <m:r>
+          <m:t>ρ</m:t>
+        </m:r>
+        <m:r>
+          <m:rPr>
+            <m:sty m:val="p"/>
+          </m:rPr>
+          <m:t>=</m:t>
+        </m:r>
+        <m:r>
+          <m:t>0.10</m:t>
+        </m:r>
+      </m:oMath>
+      <w:r>
+        <w:t xml:space="preserve">,</w:t>
+      </w:r>
+      <w:r>
+        <w:t xml:space="preserve"> </w:t>
+      </w:r>
+      <m:oMath>
+        <m:r>
+          <m:t>b</m:t>
+        </m:r>
+        <m:r>
+          <m:rPr>
+            <m:sty m:val="p"/>
+          </m:rPr>
+          <m:t>=</m:t>
+        </m:r>
+        <m:r>
+          <m:t>7</m:t>
+        </m:r>
+      </m:oMath>
+      <w:r>
+        <w:t xml:space="preserve">,</w:t>
+      </w:r>
+      <w:r>
+        <w:t xml:space="preserve"> </w:t>
+      </w:r>
+      <m:oMath>
+        <m:r>
+          <m:t>ψ</m:t>
+        </m:r>
+        <m:r>
+          <m:rPr>
+            <m:sty m:val="p"/>
+          </m:rPr>
+          <m:t>=</m:t>
+        </m:r>
+        <m:r>
+          <m:t>6</m:t>
+        </m:r>
+      </m:oMath>
+      <w:r>
+        <w:t xml:space="preserve">,</w:t>
+      </w:r>
+      <w:r>
+        <w:t xml:space="preserve"> </w:t>
+      </w:r>
+      <m:oMath>
+        <m:r>
+          <m:t>c</m:t>
+        </m:r>
+        <m:r>
+          <m:rPr>
+            <m:sty m:val="p"/>
+          </m:rPr>
+          <m:t>=</m:t>
+        </m:r>
+        <m:r>
+          <m:t>2</m:t>
+        </m:r>
+      </m:oMath>
+      <w:r>
+        <w:t xml:space="preserve">,</w:t>
+      </w:r>
+      <w:r>
+        <w:t xml:space="preserve"> </w:t>
+      </w:r>
+      <m:oMath>
+        <m:r>
+          <m:t>θ</m:t>
+        </m:r>
+        <m:r>
+          <m:rPr>
+            <m:sty m:val="p"/>
+          </m:rPr>
+          <m:t>=</m:t>
+        </m:r>
+        <m:r>
+          <m:t>0.5</m:t>
+        </m:r>
+      </m:oMath>
+      <w:r>
+        <w:t xml:space="preserve">). (b) Difference between owner and planner intensity for uniform</w:t>
+      </w:r>
+      <w:r>
+        <w:t xml:space="preserve"> </w:t>
+      </w:r>
+      <m:oMath>
+        <m:r>
+          <m:t>F</m:t>
+        </m:r>
+      </m:oMath>
+      <w:r>
+        <w:t xml:space="preserve">; the black line is the over-release boundary.</w:t>
       </w:r>
     </w:p>
     <w:bookmarkEnd w:id="50"/>
-    <w:bookmarkStart w:id="51" w:name="implications-for-research"/>
+    <w:bookmarkEnd w:id="51"/>
+    <w:bookmarkStart w:id="55" w:name="implications-for-research-and-practice"/>
+    <w:p>
+      <w:pPr>
+        <w:pStyle w:val="Heading2"/>
+      </w:pPr>
+      <w:r>
+        <w:t xml:space="preserve">8. Implications for Research and Practice</w:t>
+      </w:r>
+    </w:p>
+    <w:bookmarkStart w:id="52" w:name="implications-for-research"/>
     <w:p>
       <w:pPr>
         <w:pStyle w:val="Heading3"/>
@@ -12324,7 +12396,7 @@
         <w:t xml:space="preserve"> </w:t>
       </w:r>
       <w:r>
-        <w:t xml:space="preserve">The real-options view of IT platforms has concentrated on when to adopt. Our results show that the maintenance decision has its own option structure, with a free partial transfer (copy) knocking out blanket retraining and a costly tool surviving only in a bounded intermediate band. Empirical work on IT asset value should therefore measure recovery under upgrades, not only adoption timing.</w:t>
+        <w:t xml:space="preserve">The real-options view of IT platforms has concentrated on when to adopt. Our results show that the maintenance decision has an option structure of its own: a free partial transfer (copy) rules out blanket retraining, and a costly tool survives only in a bounded intermediate band. Empirical work on the value of IT assets should therefore measure recovery under upgrades and not only the timing of adoption.</w:t>
       </w:r>
     </w:p>
     <w:p>
@@ -12342,7 +12414,7 @@
         <w:t xml:space="preserve"> </w:t>
       </w:r>
       <w:r>
-        <w:t xml:space="preserve">Release cadence and compatibility support are governance instruments that the platform owner sets jointly, and boundary-resource provision (Ghazawneh and Henfridsson 2013) should be modeled as endogenous to platform evolution rather than as a fixed offer. Treating them separately misses their complementarity and the distributional consequence that follows. A testable implication is that, across platforms, announcements of migration or compatibility tooling should be followed by higher release frequency, and that the customers with the highest-value retrained assets should be the most likely to object.</w:t>
+        <w:t xml:space="preserve">Release cadence and compatibility support are governance instruments that the platform owner sets jointly, and the provision of boundary resources (Ghazawneh and Henfridsson 2013) should be modeled as endogenous to platform evolution rather than as a fixed offer. Treating the two separately misses their complementarity and the distributional consequence that follows. One testable implication is that announcements of migration or compatibility tooling should be followed by higher release frequency across platforms, and another is that customers with the highest-value retrained assets should be the most likely to object.</w:t>
       </w:r>
     </w:p>
     <w:p>
@@ -12360,11 +12432,11 @@
         <w:t xml:space="preserve"> </w:t>
       </w:r>
       <w:r>
-        <w:t xml:space="preserve">Platforms can separate on the speed–compatibility bundle, and customers sort across them by asset value. This suggests studying asset-level heterogeneity, not only customer-level heterogeneity, in platform choice.</w:t>
+        <w:t xml:space="preserve">Platforms can separate on the speed–compatibility bundle, and customers sort across them by asset value. Studies of platform choice should therefore consider heterogeneity at the level of the asset as well as at the level of the customer.</w:t>
       </w:r>
     </w:p>
-    <w:bookmarkEnd w:id="51"/>
-    <w:bookmarkStart w:id="52" w:name="implications-for-practice"/>
+    <w:bookmarkEnd w:id="52"/>
+    <w:bookmarkStart w:id="53" w:name="implications-for-practice"/>
     <w:p>
       <w:pPr>
         <w:pStyle w:val="Heading3"/>
@@ -12394,7 +12466,7 @@
         <w:t xml:space="preserve"> </w:t>
       </w:r>
       <w:r>
-        <w:t xml:space="preserve">Five implications do not depend on a named transfer algorithm.</w:t>
+        <w:t xml:space="preserve">Five implications follow that do not depend on any named transfer algorithm.</w:t>
       </w:r>
     </w:p>
     <w:p>
@@ -12416,7 +12488,7 @@
         <w:t xml:space="preserve"> </w:t>
       </w:r>
       <w:r>
-        <w:t xml:space="preserve">Reuse the existing adapter on the new base model first. Proposition 2(a) shows that this weakly dominates retraining immediately for every asset value, because the right to retrain later is kept. In our measurements copy recovered 91 to 99 percent of the retraining gain after small upgrades on all three tasks, leaving little for any costly method to add. Treat the default as a first step: measure copy recovery on a sample of adapters. After large upgrades, copy recovered between 12 and 99 percent depending on task and model. Compare the copied adapter with running the new model without one: for SmolLM2-1.7B the copy was worse than no adapter, in which case the right default is the base model, not the copy.</w:t>
+        <w:t xml:space="preserve">Reuse the existing adapter on the new base model first. By Proposition 2(a), this weakly dominates immediate retraining for every asset value, because the right to retrain later is kept. In our measurements copy recovered 91 to 99 percent of the retraining gain after small upgrades on all three tasks, which leaves little for any costly method to add. The default is only a first step, however, and copy recovery should be measured on a sample of adapters. After large upgrades it ranged from 12 to 99 percent, depending on the task and the model. The copied adapter should also be compared with running the new model without an adapter: for SmolLM2-1.7B the copy was worse than no adapter, and the right default there is the base model.</w:t>
       </w:r>
     </w:p>
     <w:p>
@@ -12461,7 +12533,7 @@
         </m:sSup>
       </m:oMath>
       <w:r>
-        <w:t xml:space="preserve">, which is higher than the NPV threshold and rises with upgrade intensity and volatility (Proposition 1). Triage the portfolio by value relative to retraining cost, and let the platform’s estimated</w:t>
+        <w:t xml:space="preserve">, which is higher than the NPV threshold and rises with upgrade intensity and volatility (Proposition 1). The portfolio should be triaged by value relative to retraining cost, with the platform’s estimated</w:t>
       </w:r>
       <w:r>
         <w:t xml:space="preserve"> </w:t>
@@ -12475,7 +12547,7 @@
         <w:t xml:space="preserve"> </w:t>
       </w:r>
       <w:r>
-        <w:t xml:space="preserve">set the boundaries: copy below a high cutoff, retrain above it.</w:t>
+        <w:t xml:space="preserve">setting the boundaries: copy below a high cutoff and retrain above it.</w:t>
       </w:r>
     </w:p>
     <w:p>
@@ -12516,7 +12588,7 @@
         <w:t xml:space="preserve"> </w:t>
       </w:r>
       <w:r>
-        <w:t xml:space="preserve">A costly tool can pay only in an intermediate band, and only when measured</w:t>
+        <w:t xml:space="preserve">A costly tool can pay only in an intermediate band of values, and only when its measured cost satisfies</w:t>
       </w:r>
       <w:r>
         <w:t xml:space="preserve"> </w:t>
@@ -12585,7 +12657,7 @@
         </m:d>
       </m:oMath>
       <w:r>
-        <w:t xml:space="preserve">. That inequality failed in 22 of the 24 pair-task combinations we tested (for the larger pairs, against the cost ratio of 0.36 measured on the smaller models, since we did not measure CPU costs at that scale) and held for the large upgrade of a 160M-parameter model on two tasks. It held only for a large upgrade of a 160M-parameter model, where copy recovered 40 percent. Test copy first on a sample of adapters; if it already recovers most of the gain, do not buy. If copy recovers little and the tool does not beat it by more than its cost, retrain the assets above</w:t>
+        <w:t xml:space="preserve">. That inequality failed in 22 of the 24 pair-task combinations we tested (for the larger pairs against the cost ratio of 0.36 measured on the smaller models, since we did not measure CPU costs at that scale). It held for the large upgrade of a 160M-parameter model on two tasks, where copy recovered 40 and 67 percent. Copy should be tested first on a sample of adapters, and if it already recovers most of the gain, the tool should not be bought. If copy recovers little and the tool does not beat it by more than its cost, the assets above</w:t>
       </w:r>
       <w:r>
         <w:t xml:space="preserve"> </w:t>
@@ -12611,7 +12683,7 @@
         <w:t xml:space="preserve"> </w:t>
       </w:r>
       <w:r>
-        <w:t xml:space="preserve">instead.</w:t>
+        <w:t xml:space="preserve">should be retrained instead.</w:t>
       </w:r>
     </w:p>
     <w:p>
@@ -12633,7 +12705,7 @@
         <w:t xml:space="preserve"> </w:t>
       </w:r>
       <w:r>
-        <w:t xml:space="preserve">Owner-provided migration tools should be expected to arrive with faster releases (Proposition 4a). Owners of the highest-value assets, who retrain anyway, can be made worse off by those tools. For those assets, a contractual cap on release frequency or a long-term-support line can be worth more than a better converter.</w:t>
+        <w:t xml:space="preserve">Owner-provided migration tools should be expected to arrive with faster releases (Proposition 4a). Owners of the highest-value assets, who retrain anyway, can be made worse off by those tools, and for such assets a contractual cap on release frequency or a long-term-support line can be worth more than a better converter.</w:t>
       </w:r>
     </w:p>
     <w:p>
@@ -12655,7 +12727,7 @@
         <w:t xml:space="preserve"> </w:t>
       </w:r>
       <w:r>
-        <w:t xml:space="preserve">If owners separate into frontier and stable platforms, park high-value and regulated adapters on the stable line and mid-value adapters on the frontier line. When the next dated release is near, defer retraining of adapters that sit close to</w:t>
+        <w:t xml:space="preserve">If owners separate into frontier and stable platforms, high-value and regulated adapters belong on the stable line and mid-value adapters on the frontier line. When the next dated release is near, retraining of adapters that sit close to</w:t>
       </w:r>
       <w:r>
         <w:t xml:space="preserve"> </w:t>
@@ -12678,11 +12750,14 @@
         </m:sSup>
       </m:oMath>
       <w:r>
-        <w:t xml:space="preserve">.</w:t>
+        <w:t xml:space="preserve"> </w:t>
+      </w:r>
+      <w:r>
+        <w:t xml:space="preserve">should be deferred.</w:t>
       </w:r>
     </w:p>
-    <w:bookmarkEnd w:id="52"/>
-    <w:bookmarkStart w:id="53" w:name="limitations-and-future-research"/>
+    <w:bookmarkEnd w:id="53"/>
+    <w:bookmarkStart w:id="54" w:name="limitations-and-future-research"/>
     <w:p>
       <w:pPr>
         <w:pStyle w:val="Heading3"/>
@@ -12696,7 +12771,7 @@
         <w:pStyle w:val="FirstParagraph"/>
       </w:pPr>
       <w:r>
-        <w:t xml:space="preserve">Value is taken as linear in</w:t>
+        <w:t xml:space="preserve">We take value to be linear in</w:t>
       </w:r>
       <w:r>
         <w:t xml:space="preserve"> </w:t>
@@ -12707,7 +12782,7 @@
         </m:r>
       </m:oMath>
       <w:r>
-        <w:t xml:space="preserve">; the owner’s problem is solved in the static limit, with a dynamic-threshold proxy in Section 7.4; the asymmetric compatibility equilibrium is numerical; the switching game is characterized only to first order; the recovery measurements are small-scale (160M to 3B parameters, three tasks, three to five seeds, float32 on one GPU, and only two pairs of larger models on the two added tasks); and open lines can be discontinued. The first empirical priority is</w:t>
+        <w:t xml:space="preserve">. The owner’s problem is solved in the static limit, with a dynamic-threshold proxy in Section 7.4; the asymmetric compatibility equilibrium is numerical; the switching game is characterized only to first order; and open lines can be discontinued. The recovery measurements are small in scale (160M to 3B parameters, three tasks, three to five seeds, float32 on one GPU, and only two pairs of larger models on the two added tasks). The first empirical priority is to estimate</w:t>
       </w:r>
       <w:r>
         <w:t xml:space="preserve"> </w:t>
@@ -12740,12 +12815,12 @@
         <w:t xml:space="preserve"> </w:t>
       </w:r>
       <w:r>
-        <w:t xml:space="preserve">from service logs and a historical cost accounting of copy versus retrain-every-time on a real adapter portfolio. A natural field-data test of Proposition 4(a) is whether the introduction of owner-provided migration tooling predicts a subsequent change in release frequency.</w:t>
+        <w:t xml:space="preserve">from service logs and to compile a historical cost accounting of copy versus retrain-every-time on a real adapter portfolio. A natural field-data test of Proposition 4(a) is whether the introduction of owner-provided migration tooling predicts a subsequent change in release frequency.</w:t>
       </w:r>
     </w:p>
-    <w:bookmarkEnd w:id="53"/>
     <w:bookmarkEnd w:id="54"/>
-    <w:bookmarkStart w:id="55" w:name="conclusion"/>
+    <w:bookmarkEnd w:id="55"/>
+    <w:bookmarkStart w:id="56" w:name="conclusion"/>
     <w:p>
       <w:pPr>
         <w:pStyle w:val="Heading2"/>
@@ -12759,11 +12834,11 @@
         <w:pStyle w:val="FirstParagraph"/>
       </w:pPr>
       <w:r>
-        <w:t xml:space="preserve">The paper’s practical message is a default, free copy, and its theoretical claim is not that any particular converter is optimal. It is that complementary assets on an evolving platform create a maintenance option; that a free partial transfer already knocks out blanket retraining; that a costly converter has a market only in a bounded intermediate band; and that the platform owner, facing that band, will use improvements in the converter to go faster. Competing owners internalize a fixed fraction of the resulting change in customer surplus; in the logit workhorse the fraction is one-third. Platforms are not only bundles of options for adopters (Fichman 2004). They are also the agents that choose how fast those options expire.</w:t>
+        <w:t xml:space="preserve">The practical message of the paper is a default, free copy, and its theoretical claim is not that any particular converter is optimal. The claim is that complementary assets on an evolving platform create a maintenance option; that a free partial transfer already rules out blanket retraining; that a costly converter has a market only in a bounded intermediate band; and that the platform owner, facing that band, will use improvements in the converter to go faster. Competing owners internalize a fixed fraction of the resulting change in customer surplus, which is one-third in the logit workhorse. Platforms are not only bundles of options for adopters (Fichman 2004); they are also the agents that choose how fast those options expire.</w:t>
       </w:r>
     </w:p>
-    <w:bookmarkEnd w:id="55"/>
-    <w:bookmarkStart w:id="56" w:name="references"/>
+    <w:bookmarkEnd w:id="56"/>
+    <w:bookmarkStart w:id="57" w:name="references"/>
     <w:p>
       <w:pPr>
         <w:pStyle w:val="Heading2"/>
@@ -13495,8 +13570,8 @@
         <w:t xml:space="preserve">21(4):724–735.</w:t>
       </w:r>
     </w:p>
-    <w:bookmarkEnd w:id="56"/>
-    <w:bookmarkStart w:id="57" w:name="Xa9655facc0fef39d2d1857b7da2b9b7690d1ce1"/>
+    <w:bookmarkEnd w:id="57"/>
+    <w:bookmarkStart w:id="58" w:name="Xa9655facc0fef39d2d1857b7da2b9b7690d1ce1"/>
     <w:p>
       <w:pPr>
         <w:pStyle w:val="Heading2"/>
@@ -19788,8 +19863,8 @@
         <w:t xml:space="preserve">Numerical Finding 1 is a grid search, not a proof. The two-period switching extension in Section 7.3 is a first-order characterization, not an equilibrium existence theorem.</w:t>
       </w:r>
     </w:p>
-    <w:bookmarkEnd w:id="57"/>
-    <w:bookmarkStart w:id="58" w:name="appendix-b.-additional-results"/>
+    <w:bookmarkEnd w:id="58"/>
+    <w:bookmarkStart w:id="59" w:name="appendix-b.-additional-results"/>
     <w:p>
       <w:pPr>
         <w:pStyle w:val="Heading2"/>
@@ -20387,8 +20462,8 @@
         </m:r>
       </m:oMath>
     </w:p>
-    <w:bookmarkEnd w:id="58"/>
-    <w:bookmarkStart w:id="59" w:name="X0f31936179fd3bd470ed8a078b91c99dbb3660c"/>
+    <w:bookmarkEnd w:id="59"/>
+    <w:bookmarkStart w:id="60" w:name="X0f31936179fd3bd470ed8a078b91c99dbb3660c"/>
     <w:p>
       <w:pPr>
         <w:pStyle w:val="Heading2"/>
@@ -20402,7 +20477,7 @@
         <w:pStyle w:val="FirstParagraph"/>
       </w:pPr>
       <w:r>
-        <w:t xml:space="preserve">The following table is the measurement used to pin</w:t>
+        <w:t xml:space="preserve">The tables below report the measurements used to pin</w:t>
       </w:r>
       <w:r>
         <w:t xml:space="preserve"> </w:t>
@@ -20435,7 +20510,7 @@
         <w:t xml:space="preserve"> </w:t>
       </w:r>
       <w:r>
-        <w:t xml:space="preserve">in Section 3.3. Table C.1 covers 160M to 0.5B parameters and Table C.2 covers 1.4B to 3B parameters; all pairs use one task (GSM8K), and a short training budget (500 training problems, 300 steps). Each pair was run with five seeds (0 to 4) on a single GPU in float32; the seed resamples the training and calibration rows and the training order, and the 200 evaluation rows are fixed. Recovery is</w:t>
+        <w:t xml:space="preserve">in Section 3.3. Tables C.1 and C.2 cover math reasoning (GSM8K), with 160M to 0.5B parameters in Table C.1 and 1.4B to 3B parameters in Table C.2; the other two tasks are described below and reported in Table C.3. All runs use a short training budget (500 training problems and 300 steps). Each pair was run with five seeds (0 to 4) on a single GPU in float32. The seed resamples the training and calibration rows and the training order, and the 200 evaluation rows are fixed. Recovery is</w:t>
       </w:r>
       <w:r>
         <w:t xml:space="preserve"> </w:t>
@@ -21051,7 +21126,7 @@
         <w:t xml:space="preserve"> </w:t>
       </w:r>
       <w:r>
-        <w:t xml:space="preserve">The cost ratios are wall-clock ratios from CPU runs (seed 0 for the Pythia +10k and +70k pairs; the other three from a single earlier CPU run), because on a GPU the fixed overhead of the calibration method dominates and the ratio is not informative. Recovery on CPU with seed 0 is 0.940 and 0.941 for Pythia +10k and 0.242 and 0.584 for Pythia +70k (copy and calibration method), so the recovery estimates do not depend on the device beyond the sampling spread; the large-upgrade copy recovery has the widest spread across seeds (0.31 to 0.51 on GPU).</w:t>
+        <w:t xml:space="preserve">The cost ratios are wall-clock ratios from CPU runs (seed 0 for the Pythia +10k and +70k pairs, and a single earlier CPU run for the other three). On a GPU the fixed overhead of the calibration method dominates, so the ratio is not informative there. Recovery on CPU with seed 0 is 0.940 and 0.941 for Pythia +10k and 0.242 and 0.584 for Pythia +70k (copy and calibration method), so the recovery estimates do not depend on the device beyond the sampling spread. The large-upgrade copy recovery has the widest spread across seeds (0.31 to 0.51 on GPU).</w:t>
       </w:r>
     </w:p>
     <w:p>
@@ -21059,7 +21134,7 @@
         <w:pStyle w:val="BodyText"/>
       </w:pPr>
       <w:r>
-        <w:t xml:space="preserve">The calibration method matches, at each layer, the change in hidden activations that the source adapter produces on unlabeled inputs, with a ridge term that anchors the solution to naive copy. As the ridge diverges the method equals copy. Cost is forward passes plus per-layer linear algebra. Full protocol: public checkpoints from EleutherAI/pythia-160m (steps 73000, 113000, 133000 → 143000), HuggingFaceTB/SmolLM2-360M, and Qwen/Qwen2.5-0.5B; rank-8 LoRA on every linear layer in the decoder; 500 GSM8K training problems; 300 AdamW steps; 128 unlabeled calibration prompts.</w:t>
+        <w:t xml:space="preserve">The calibration method matches, at each layer, the change in hidden activations that the source adapter produces on unlabeled inputs, with a ridge term that anchors the solution to naive copy. As the ridge diverges, the method equals copy. Its cost is forward passes plus per-layer linear algebra. The full protocol uses public checkpoints from EleutherAI/pythia-160m (steps 73000, 113000, and 133000, each upgraded to step 143000), HuggingFaceTB/SmolLM2-360M, and Qwen/Qwen2.5-0.5B, with rank-8 LoRA on every linear layer in the decoder, 500 GSM8K training problems, 300 AdamW steps, and 128 unlabeled calibration prompts.</w:t>
       </w:r>
     </w:p>
     <w:p>
@@ -21122,7 +21197,7 @@
         <w:t xml:space="preserve">”</w:t>
       </w:r>
       <w:r>
-        <w:t xml:space="preserve">); the dataset has no test split, so a fixed pool of 2,000 rows is held out for evaluation and the training and calibration rows of every seed are drawn from the rest. All other settings are as above. A seed is dropped when its retraining gain (the loss without an adapter minus the loss after retraining) is less than half the median gain of the same pair, because the recovery ratio is meaningless when the retraining upper bound has failed; this rule dropped one seed (Pythia-160M +30k on SQL, retraining loss 1.27 against 0.50 to 0.59 for the other seeds) and none in the other cells.</w:t>
+        <w:t xml:space="preserve">). That dataset has no test split, so a fixed pool of 2,000 rows is held out for evaluation and the training and calibration rows of every seed are drawn from the rest. All other settings are as above. A seed is dropped when its retraining gain (the loss without an adapter minus the loss after retraining) is less than half the median gain of the same pair, because the recovery ratio is meaningless once the retraining upper bound has failed. This rule dropped one seed (Pythia-160M +30k on SQL, with a retraining loss of 1.27 against 0.50 to 0.59 for the other seeds) and none in the other cells.</w:t>
       </w:r>
     </w:p>
     <w:p>
@@ -21140,7 +21215,7 @@
         <w:t xml:space="preserve"> </w:t>
       </w:r>
       <w:r>
-        <w:t xml:space="preserve">Table C.2 repeats the design with 1.4B to 3B parameters, using the same task, hyperparameters, and float32 precision. Seeds run on one GPU; the Qwen2.5-3B pair has four seeds because the fifth was cut off by the time limit of the run.</w:t>
+        <w:t xml:space="preserve">Table C.2 repeats the design with 1.4B to 3B parameters, using the same task, hyperparameters, and float32 precision. Seeds were run on one GPU. The Qwen2.5-3B pair has four seeds because the fifth was cut off by the time limit of the run.</w:t>
       </w:r>
     </w:p>
     <w:tbl>
@@ -21617,7 +21692,7 @@
         <w:t xml:space="preserve"> </w:t>
       </w:r>
       <w:r>
-        <w:t xml:space="preserve">Recovery above one is sampling noise around full recovery. For SmolLM2-1.7B the copied adapter has higher held-out loss (about 0.77) than the target without any adapter (0.677), and the retraining gain is only about 0.08, so the ratio is large and negative; in the model this pair has</w:t>
+        <w:t xml:space="preserve">Recovery above one is sampling noise around full recovery. For SmolLM2-1.7B the copied adapter has a higher held-out loss (about 0.77) than the target without any adapter (0.677), and the retraining gain is only about 0.08, so the ratio is large and negative; in the model this pair has</w:t>
       </w:r>
       <w:r>
         <w:t xml:space="preserve"> </w:t>
@@ -21664,7 +21739,7 @@
         </m:r>
       </m:oMath>
       <w:r>
-        <w:t xml:space="preserve">. The wall-clock cost ratios of these runs are not reported because on a GPU they are dominated by fixed overhead; a CPU measurement at this scale was not run.</w:t>
+        <w:t xml:space="preserve">. We do not report wall-clock cost ratios for these runs, because on a GPU they are dominated by fixed overhead, and we did not run a CPU measurement at this scale.</w:t>
       </w:r>
     </w:p>
     <w:p>
@@ -21696,7 +21771,7 @@
         <w:t xml:space="preserve"> </w:t>
       </w:r>
       <w:r>
-        <w:t xml:space="preserve">is the CPU compute-only ratio of the pair for the 160M to 0.5B models and 0.36 for the larger models, and is the same for each task.</w:t>
+        <w:t xml:space="preserve">is the CPU compute-only ratio of the pair for the 160M to 0.5B models and 0.36 for the larger models, and it is the same for each task.</w:t>
       </w:r>
       <w:r>
         <w:t xml:space="preserve"> </w:t>
@@ -24004,7 +24079,7 @@
         <w:t xml:space="preserve"> </w:t>
       </w:r>
       <w:r>
-        <w:t xml:space="preserve">means</w:t>
+        <w:t xml:space="preserve">means that</w:t>
       </w:r>
       <w:r>
         <w:t xml:space="preserve"> </w:t>
@@ -24018,7 +24093,7 @@
         <w:t xml:space="preserve"> </w:t>
       </w:r>
       <w:r>
-        <w:t xml:space="preserve">exceeds the cost reference; it is borderline for Pythia-160M +70k on DialogSum (</w:t>
+        <w:t xml:space="preserve">exceeds the cost reference. The case of Pythia-160M +70k on DialogSum is borderline (</w:t>
       </w:r>
       <m:oMath>
         <m:r>
@@ -24041,8 +24116,8 @@
         <w:t xml:space="preserve">against 0.359).</w:t>
       </w:r>
     </w:p>
-    <w:bookmarkEnd w:id="59"/>
-    <w:bookmarkStart w:id="60" w:name="appendix-d.-date-verification"/>
+    <w:bookmarkEnd w:id="60"/>
+    <w:bookmarkStart w:id="61" w:name="appendix-d.-date-verification"/>
     <w:p>
       <w:pPr>
         <w:pStyle w:val="Heading2"/>
@@ -24334,8 +24409,8 @@
         <w:t xml:space="preserve">Classification retained: LLaMA 1 research-license weights counted as origin; instruct-only twins and extra sizes excluded from primary; QwQ, DeepSeek-R1, and refreshed checkpoints counted only under the broad definition.</w:t>
       </w:r>
     </w:p>
-    <w:bookmarkEnd w:id="60"/>
-    <w:bookmarkStart w:id="61" w:name="appendix-e.-replication-materials"/>
+    <w:bookmarkEnd w:id="61"/>
+    <w:bookmarkStart w:id="62" w:name="appendix-e.-replication-materials"/>
     <w:p>
       <w:pPr>
         <w:pStyle w:val="Heading2"/>
@@ -24349,11 +24424,11 @@
         <w:pStyle w:val="FirstParagraph"/>
       </w:pPr>
       <w:r>
-        <w:t xml:space="preserve">The replication package contains the release-history file, the intensity-estimation script, the robustness script, the owner-model and dynamic-threshold scripts, the figure script, and saved numerical output. It does not contain weights or training logs from the five small-model pairs; those are calibration inputs described in Appendix C. The package also contains the multi-seed driver, the aggregation script, the parameter-grid script of Appendix F, the task-combination script, and the per-seed result files. No proprietary or subscription data are used. An anonymized copy of the package will be provided to reviewers on request.</w:t>
+        <w:t xml:space="preserve">The replication package contains the release-history file, the intensity-estimation script, the robustness script, the owner-model and dynamic-threshold scripts, the figure script, the multi-seed driver, the aggregation script, the parameter-grid script of Appendix F, the task-combination script, and the saved numerical output, including the per-seed result files. It does not contain weights or training logs from the model pairs; those are calibration inputs described in Appendix C. No proprietary or subscription data are used. An anonymized copy of the package will be provided to reviewers on request.</w:t>
       </w:r>
     </w:p>
-    <w:bookmarkEnd w:id="61"/>
-    <w:bookmarkStart w:id="62" w:name="Xcbfed8b408a7ad6d0ef111d1d5dafab9d9b8a72"/>
+    <w:bookmarkEnd w:id="62"/>
+    <w:bookmarkStart w:id="63" w:name="Xcbfed8b408a7ad6d0ef111d1d5dafab9d9b8a72"/>
     <w:p>
       <w:pPr>
         <w:pStyle w:val="Heading2"/>
@@ -24367,7 +24442,7 @@
         <w:pStyle w:val="FirstParagraph"/>
       </w:pPr>
       <w:r>
-        <w:t xml:space="preserve">Grid:</w:t>
+        <w:t xml:space="preserve">The grid is</w:t>
       </w:r>
       <w:r>
         <w:t xml:space="preserve"> </w:t>
@@ -24644,7 +24719,7 @@
         </m:r>
       </m:oMath>
       <w:r>
-        <w:t xml:space="preserve">,</w:t>
+        <w:t xml:space="preserve">, and</w:t>
       </w:r>
       <w:r>
         <w:t xml:space="preserve"> </w:t>
@@ -24712,7 +24787,7 @@
         </m:r>
       </m:oMath>
       <w:r>
-        <w:t xml:space="preserve">,</w:t>
+        <w:t xml:space="preserve">, with</w:t>
       </w:r>
       <w:r>
         <w:t xml:space="preserve"> </w:t>
@@ -24741,7 +24816,10 @@
         </m:r>
       </m:oMath>
       <w:r>
-        <w:t xml:space="preserve">,</w:t>
+        <w:t xml:space="preserve"> </w:t>
+      </w:r>
+      <w:r>
+        <w:t xml:space="preserve">and</w:t>
       </w:r>
       <w:r>
         <w:t xml:space="preserve"> </w:t>
@@ -24761,7 +24839,7 @@
         </m:r>
       </m:oMath>
       <w:r>
-        <w:t xml:space="preserve">; all value distributions have mean 20. A cell is valid if the owner’s and the planner’s objectives are concave on the whole intensity grid and both maximizers are interior. Cells that fail concavity violate the hypothesis of Propositions 3(b) and 5(d); cells with a corner solution are those in which the owner prefers no release at all or the maximizer lies at the upper end of the grid. Slopes are computed between adjacent</w:t>
+        <w:t xml:space="preserve">; all value distributions have mean 20. A cell is valid if the owner’s and the planner’s objectives are concave on the whole intensity grid and both maximizers are interior. Cells that fail concavity violate the hypothesis of Propositions 3(b) and 5(d), and cells with a corner solution are those in which the owner prefers no release at all or the maximizer lies at the upper end of the grid. Slopes are computed between adjacent values of</w:t>
       </w:r>
       <w:r>
         <w:t xml:space="preserve"> </w:t>
@@ -24772,10 +24850,7 @@
         </m:r>
       </m:oMath>
       <w:r>
-        <w:t xml:space="preserve"> </w:t>
-      </w:r>
-      <w:r>
-        <w:t xml:space="preserve">values;</w:t>
+        <w:t xml:space="preserve">, and</w:t>
       </w:r>
       <w:r>
         <w:t xml:space="preserve"> </w:t>
@@ -25528,7 +25603,7 @@
         <w:t xml:space="preserve"> </w:t>
       </w:r>
       <w:r>
-        <w:t xml:space="preserve">The Pareto row has few valid cells because its heavy tail makes the planner’s objective nonconcave in most of the grid; its zero cells are those in which</w:t>
+        <w:t xml:space="preserve">The Pareto row has few valid cells because its heavy tail makes the planner’s objective nonconcave over most of the grid. Its zero cells are those in which</w:t>
       </w:r>
       <w:r>
         <w:t xml:space="preserve"> </w:t>
@@ -25552,7 +25627,7 @@
         <w:t xml:space="preserve">lies below the Pareto lower bound, so that every firm retrains.</w:t>
       </w:r>
     </w:p>
-    <w:bookmarkEnd w:id="62"/>
+    <w:bookmarkEnd w:id="63"/>
     <w:sectPr/>
   </w:body>
 </w:document>

</xml_diff>